<commit_message>
Add detailed explanation of DTO, class-validator, and class-transformer in validation documentation
</commit_message>
<xml_diff>
--- a/Docs/03. Validation And Pipes.docx
+++ b/Docs/03. Validation And Pipes.docx
@@ -3212,7 +3212,7 @@
     <w:p>
       <w:r>
         <w:pict w14:anchorId="4DC93259">
-          <v:rect id="_x0000_i1040" style="width:0;height:1.5pt" o:hralign="center" o:hrstd="t" o:hrnoshade="t" o:hr="t" fillcolor="gray" stroked="f"/>
+          <v:rect id="_x0000_i1028" style="width:0;height:1.5pt" o:hralign="center" o:hrstd="t" o:hrnoshade="t" o:hr="t" fillcolor="gray" stroked="f"/>
         </w:pict>
       </w:r>
     </w:p>
@@ -5231,7 +5231,7 @@
     <w:p>
       <w:r>
         <w:pict w14:anchorId="3A9D5946">
-          <v:rect id="_x0000_i1041" style="width:0;height:1.5pt" o:hralign="center" o:hrstd="t" o:hrnoshade="t" o:hr="t" fillcolor="gray" stroked="f"/>
+          <v:rect id="_x0000_i1029" style="width:0;height:1.5pt" o:hralign="center" o:hrstd="t" o:hrnoshade="t" o:hr="t" fillcolor="gray" stroked="f"/>
         </w:pict>
       </w:r>
     </w:p>
@@ -6031,6 +6031,3954 @@
         <w:t>হবে।</w:t>
       </w:r>
     </w:p>
+    <w:p>
+      <w:r>
+        <w:br w:type="page"/>
+      </w:r>
+    </w:p>
+    <w:p>
+      <w:pPr>
+        <w:jc w:val="center"/>
+        <w:rPr>
+          <w:b/>
+          <w:bCs/>
+          <w:sz w:val="36"/>
+          <w:szCs w:val="36"/>
+        </w:rPr>
+      </w:pPr>
+      <w:r>
+        <w:rPr>
+          <w:b/>
+          <w:bCs/>
+          <w:sz w:val="36"/>
+          <w:szCs w:val="36"/>
+        </w:rPr>
+        <w:lastRenderedPageBreak/>
+        <w:t>DTO (Data Transfer Object)</w:t>
+      </w:r>
+    </w:p>
+    <w:p>
+      <w:r>
+        <w:t>NestJS-</w:t>
+      </w:r>
+      <w:r>
+        <w:rPr>
+          <w:rFonts w:ascii="Nirmala UI" w:hAnsi="Nirmala UI" w:cs="Nirmala UI"/>
+        </w:rPr>
+        <w:t>এ</w:t>
+      </w:r>
+      <w:r>
+        <w:t xml:space="preserve"> </w:t>
+      </w:r>
+      <w:r>
+        <w:rPr>
+          <w:rFonts w:ascii="Nirmala UI" w:hAnsi="Nirmala UI" w:cs="Nirmala UI"/>
+        </w:rPr>
+        <w:t>ডাটা</w:t>
+      </w:r>
+      <w:r>
+        <w:t xml:space="preserve"> </w:t>
+      </w:r>
+      <w:r>
+        <w:rPr>
+          <w:rFonts w:ascii="Nirmala UI" w:hAnsi="Nirmala UI" w:cs="Nirmala UI"/>
+        </w:rPr>
+        <w:t>ভ্যালিডেশন</w:t>
+      </w:r>
+      <w:r>
+        <w:t xml:space="preserve"> </w:t>
+      </w:r>
+      <w:r>
+        <w:rPr>
+          <w:rFonts w:ascii="Nirmala UI" w:hAnsi="Nirmala UI" w:cs="Nirmala UI"/>
+        </w:rPr>
+        <w:t>এবং</w:t>
+      </w:r>
+      <w:r>
+        <w:t xml:space="preserve"> </w:t>
+      </w:r>
+      <w:r>
+        <w:rPr>
+          <w:rFonts w:ascii="Nirmala UI" w:hAnsi="Nirmala UI" w:cs="Nirmala UI"/>
+        </w:rPr>
+        <w:t>হ্যান্ডেল</w:t>
+      </w:r>
+      <w:r>
+        <w:t xml:space="preserve"> </w:t>
+      </w:r>
+      <w:r>
+        <w:rPr>
+          <w:rFonts w:ascii="Nirmala UI" w:hAnsi="Nirmala UI" w:cs="Nirmala UI"/>
+        </w:rPr>
+        <w:t>করার</w:t>
+      </w:r>
+      <w:r>
+        <w:t xml:space="preserve"> </w:t>
+      </w:r>
+      <w:r>
+        <w:rPr>
+          <w:rFonts w:ascii="Nirmala UI" w:hAnsi="Nirmala UI" w:cs="Nirmala UI"/>
+        </w:rPr>
+        <w:t>জন্য</w:t>
+      </w:r>
+      <w:r>
+        <w:t xml:space="preserve"> </w:t>
+      </w:r>
+      <w:r>
+        <w:rPr>
+          <w:rFonts w:ascii="Nirmala UI" w:hAnsi="Nirmala UI" w:cs="Nirmala UI"/>
+        </w:rPr>
+        <w:t>এই</w:t>
+      </w:r>
+      <w:r>
+        <w:t xml:space="preserve"> </w:t>
+      </w:r>
+      <w:r>
+        <w:rPr>
+          <w:rFonts w:ascii="Nirmala UI" w:hAnsi="Nirmala UI" w:cs="Nirmala UI"/>
+        </w:rPr>
+        <w:t>তিনটি</w:t>
+      </w:r>
+      <w:r>
+        <w:t xml:space="preserve"> </w:t>
+      </w:r>
+      <w:r>
+        <w:rPr>
+          <w:rFonts w:ascii="Nirmala UI" w:hAnsi="Nirmala UI" w:cs="Nirmala UI"/>
+        </w:rPr>
+        <w:t>জিনিস</w:t>
+      </w:r>
+      <w:r>
+        <w:t xml:space="preserve"> </w:t>
+      </w:r>
+      <w:r>
+        <w:rPr>
+          <w:rFonts w:ascii="Nirmala UI" w:hAnsi="Nirmala UI" w:cs="Nirmala UI"/>
+        </w:rPr>
+        <w:t>একে</w:t>
+      </w:r>
+      <w:r>
+        <w:t xml:space="preserve"> </w:t>
+      </w:r>
+      <w:r>
+        <w:rPr>
+          <w:rFonts w:ascii="Nirmala UI" w:hAnsi="Nirmala UI" w:cs="Nirmala UI"/>
+        </w:rPr>
+        <w:t>অপরের</w:t>
+      </w:r>
+      <w:r>
+        <w:t xml:space="preserve"> </w:t>
+      </w:r>
+      <w:r>
+        <w:rPr>
+          <w:rFonts w:ascii="Nirmala UI" w:hAnsi="Nirmala UI" w:cs="Nirmala UI"/>
+        </w:rPr>
+        <w:t>সাথে</w:t>
+      </w:r>
+      <w:r>
+        <w:t xml:space="preserve"> </w:t>
+      </w:r>
+      <w:r>
+        <w:rPr>
+          <w:rFonts w:ascii="Nirmala UI" w:hAnsi="Nirmala UI" w:cs="Nirmala UI"/>
+        </w:rPr>
+        <w:t>ওতপ্রোতভাবে</w:t>
+      </w:r>
+      <w:r>
+        <w:t xml:space="preserve"> </w:t>
+      </w:r>
+      <w:r>
+        <w:rPr>
+          <w:rFonts w:ascii="Nirmala UI" w:hAnsi="Nirmala UI" w:cs="Nirmala UI"/>
+        </w:rPr>
+        <w:t>জড়িত।</w:t>
+      </w:r>
+      <w:r>
+        <w:t xml:space="preserve"> </w:t>
+      </w:r>
+      <w:r>
+        <w:rPr>
+          <w:rFonts w:ascii="Nirmala UI" w:hAnsi="Nirmala UI" w:cs="Nirmala UI"/>
+        </w:rPr>
+        <w:t>চলো</w:t>
+      </w:r>
+      <w:r>
+        <w:t xml:space="preserve"> </w:t>
+      </w:r>
+      <w:r>
+        <w:rPr>
+          <w:rFonts w:ascii="Nirmala UI" w:hAnsi="Nirmala UI" w:cs="Nirmala UI"/>
+        </w:rPr>
+        <w:t>এগুলো</w:t>
+      </w:r>
+      <w:r>
+        <w:t xml:space="preserve"> </w:t>
+      </w:r>
+      <w:r>
+        <w:rPr>
+          <w:rFonts w:ascii="Nirmala UI" w:hAnsi="Nirmala UI" w:cs="Nirmala UI"/>
+        </w:rPr>
+        <w:t>খুব</w:t>
+      </w:r>
+      <w:r>
+        <w:t xml:space="preserve"> </w:t>
+      </w:r>
+      <w:r>
+        <w:rPr>
+          <w:rFonts w:ascii="Nirmala UI" w:hAnsi="Nirmala UI" w:cs="Nirmala UI"/>
+        </w:rPr>
+        <w:t>সহজে</w:t>
+      </w:r>
+      <w:r>
+        <w:t xml:space="preserve"> </w:t>
+      </w:r>
+      <w:r>
+        <w:rPr>
+          <w:rFonts w:ascii="Nirmala UI" w:hAnsi="Nirmala UI" w:cs="Nirmala UI"/>
+        </w:rPr>
+        <w:t>বুঝে</w:t>
+      </w:r>
+      <w:r>
+        <w:t xml:space="preserve"> </w:t>
+      </w:r>
+      <w:r>
+        <w:rPr>
+          <w:rFonts w:ascii="Nirmala UI" w:hAnsi="Nirmala UI" w:cs="Nirmala UI"/>
+        </w:rPr>
+        <w:t>নিই</w:t>
+      </w:r>
+      <w:r>
+        <w:t>:</w:t>
+      </w:r>
+    </w:p>
+    <w:p>
+      <w:r>
+        <w:pict w14:anchorId="7945507E">
+          <v:rect id="_x0000_i1060" style="width:0;height:1.5pt" o:hralign="center" o:hrstd="t" o:hrnoshade="t" o:hr="t" fillcolor="gray" stroked="f"/>
+        </w:pict>
+      </w:r>
+    </w:p>
+    <w:p>
+      <w:pPr>
+        <w:rPr>
+          <w:b/>
+          <w:bCs/>
+          <w:lang w:val="pt-PT"/>
+        </w:rPr>
+      </w:pPr>
+      <w:r>
+        <w:rPr>
+          <w:rFonts w:ascii="Nirmala UI" w:hAnsi="Nirmala UI" w:cs="Nirmala UI"/>
+          <w:b/>
+          <w:bCs/>
+        </w:rPr>
+        <w:t>১</w:t>
+      </w:r>
+      <w:r>
+        <w:rPr>
+          <w:b/>
+          <w:bCs/>
+          <w:lang w:val="pt-PT"/>
+        </w:rPr>
+        <w:t xml:space="preserve">. DTO (Data Transfer Object) </w:t>
+      </w:r>
+      <w:r>
+        <w:rPr>
+          <w:rFonts w:ascii="Nirmala UI" w:hAnsi="Nirmala UI" w:cs="Nirmala UI"/>
+          <w:b/>
+          <w:bCs/>
+        </w:rPr>
+        <w:t>কি</w:t>
+      </w:r>
+      <w:r>
+        <w:rPr>
+          <w:b/>
+          <w:bCs/>
+          <w:lang w:val="pt-PT"/>
+        </w:rPr>
+        <w:t>?</w:t>
+      </w:r>
+    </w:p>
+    <w:p>
+      <w:pPr>
+        <w:rPr>
+          <w:lang w:val="pt-PT"/>
+        </w:rPr>
+      </w:pPr>
+      <w:r>
+        <w:rPr>
+          <w:b/>
+          <w:bCs/>
+          <w:lang w:val="pt-PT"/>
+        </w:rPr>
+        <w:t>DTO</w:t>
+      </w:r>
+      <w:r>
+        <w:rPr>
+          <w:lang w:val="pt-PT"/>
+        </w:rPr>
+        <w:t xml:space="preserve"> </w:t>
+      </w:r>
+      <w:r>
+        <w:rPr>
+          <w:rFonts w:ascii="Nirmala UI" w:hAnsi="Nirmala UI" w:cs="Nirmala UI"/>
+        </w:rPr>
+        <w:t>হলো</w:t>
+      </w:r>
+      <w:r>
+        <w:rPr>
+          <w:lang w:val="pt-PT"/>
+        </w:rPr>
+        <w:t xml:space="preserve"> </w:t>
+      </w:r>
+      <w:r>
+        <w:rPr>
+          <w:rFonts w:ascii="Nirmala UI" w:hAnsi="Nirmala UI" w:cs="Nirmala UI"/>
+        </w:rPr>
+        <w:t>একটি</w:t>
+      </w:r>
+      <w:r>
+        <w:rPr>
+          <w:lang w:val="pt-PT"/>
+        </w:rPr>
+        <w:t xml:space="preserve"> </w:t>
+      </w:r>
+      <w:r>
+        <w:rPr>
+          <w:rFonts w:ascii="Nirmala UI" w:hAnsi="Nirmala UI" w:cs="Nirmala UI"/>
+        </w:rPr>
+        <w:t>সিম্পল</w:t>
+      </w:r>
+      <w:r>
+        <w:rPr>
+          <w:lang w:val="pt-PT"/>
+        </w:rPr>
+        <w:t xml:space="preserve"> </w:t>
+      </w:r>
+      <w:r>
+        <w:rPr>
+          <w:rFonts w:ascii="Nirmala UI" w:hAnsi="Nirmala UI" w:cs="Nirmala UI"/>
+        </w:rPr>
+        <w:t>ক্লাস</w:t>
+      </w:r>
+      <w:r>
+        <w:rPr>
+          <w:lang w:val="pt-PT"/>
+        </w:rPr>
+        <w:t xml:space="preserve"> </w:t>
+      </w:r>
+      <w:r>
+        <w:rPr>
+          <w:rFonts w:ascii="Nirmala UI" w:hAnsi="Nirmala UI" w:cs="Nirmala UI"/>
+        </w:rPr>
+        <w:t>যা</w:t>
+      </w:r>
+      <w:r>
+        <w:rPr>
+          <w:lang w:val="pt-PT"/>
+        </w:rPr>
+        <w:t xml:space="preserve"> </w:t>
+      </w:r>
+      <w:r>
+        <w:rPr>
+          <w:rFonts w:ascii="Nirmala UI" w:hAnsi="Nirmala UI" w:cs="Nirmala UI"/>
+        </w:rPr>
+        <w:t>নির্ধারণ</w:t>
+      </w:r>
+      <w:r>
+        <w:rPr>
+          <w:lang w:val="pt-PT"/>
+        </w:rPr>
+        <w:t xml:space="preserve"> </w:t>
+      </w:r>
+      <w:r>
+        <w:rPr>
+          <w:rFonts w:ascii="Nirmala UI" w:hAnsi="Nirmala UI" w:cs="Nirmala UI"/>
+        </w:rPr>
+        <w:t>করে</w:t>
+      </w:r>
+      <w:r>
+        <w:rPr>
+          <w:lang w:val="pt-PT"/>
+        </w:rPr>
+        <w:t xml:space="preserve"> </w:t>
+      </w:r>
+      <w:r>
+        <w:rPr>
+          <w:rFonts w:ascii="Nirmala UI" w:hAnsi="Nirmala UI" w:cs="Nirmala UI"/>
+        </w:rPr>
+        <w:t>একটি</w:t>
+      </w:r>
+      <w:r>
+        <w:rPr>
+          <w:lang w:val="pt-PT"/>
+        </w:rPr>
+        <w:t xml:space="preserve"> </w:t>
+      </w:r>
+      <w:r>
+        <w:rPr>
+          <w:rFonts w:ascii="Nirmala UI" w:hAnsi="Nirmala UI" w:cs="Nirmala UI"/>
+        </w:rPr>
+        <w:t>রিকোয়েস্টের</w:t>
+      </w:r>
+      <w:r>
+        <w:rPr>
+          <w:lang w:val="pt-PT"/>
+        </w:rPr>
+        <w:t xml:space="preserve"> </w:t>
+      </w:r>
+      <w:r>
+        <w:rPr>
+          <w:rFonts w:ascii="Nirmala UI" w:hAnsi="Nirmala UI" w:cs="Nirmala UI"/>
+        </w:rPr>
+        <w:t>সাথে</w:t>
+      </w:r>
+      <w:r>
+        <w:rPr>
+          <w:lang w:val="pt-PT"/>
+        </w:rPr>
+        <w:t xml:space="preserve"> </w:t>
+      </w:r>
+      <w:r>
+        <w:rPr>
+          <w:rFonts w:ascii="Nirmala UI" w:hAnsi="Nirmala UI" w:cs="Nirmala UI"/>
+        </w:rPr>
+        <w:t>কী</w:t>
+      </w:r>
+      <w:r>
+        <w:rPr>
+          <w:lang w:val="pt-PT"/>
+        </w:rPr>
+        <w:t xml:space="preserve"> </w:t>
+      </w:r>
+      <w:r>
+        <w:rPr>
+          <w:rFonts w:ascii="Nirmala UI" w:hAnsi="Nirmala UI" w:cs="Nirmala UI"/>
+        </w:rPr>
+        <w:t>কী</w:t>
+      </w:r>
+      <w:r>
+        <w:rPr>
+          <w:lang w:val="pt-PT"/>
+        </w:rPr>
+        <w:t xml:space="preserve"> </w:t>
+      </w:r>
+      <w:r>
+        <w:rPr>
+          <w:rFonts w:ascii="Nirmala UI" w:hAnsi="Nirmala UI" w:cs="Nirmala UI"/>
+        </w:rPr>
+        <w:t>ডাটা</w:t>
+      </w:r>
+      <w:r>
+        <w:rPr>
+          <w:lang w:val="pt-PT"/>
+        </w:rPr>
+        <w:t xml:space="preserve"> </w:t>
+      </w:r>
+      <w:r>
+        <w:rPr>
+          <w:rFonts w:ascii="Nirmala UI" w:hAnsi="Nirmala UI" w:cs="Nirmala UI"/>
+        </w:rPr>
+        <w:t>আসবে</w:t>
+      </w:r>
+      <w:r>
+        <w:rPr>
+          <w:lang w:val="pt-PT"/>
+        </w:rPr>
+        <w:t xml:space="preserve"> </w:t>
+      </w:r>
+      <w:r>
+        <w:rPr>
+          <w:rFonts w:ascii="Nirmala UI" w:hAnsi="Nirmala UI" w:cs="Nirmala UI"/>
+        </w:rPr>
+        <w:t>এবং</w:t>
+      </w:r>
+      <w:r>
+        <w:rPr>
+          <w:lang w:val="pt-PT"/>
+        </w:rPr>
+        <w:t xml:space="preserve"> </w:t>
+      </w:r>
+      <w:r>
+        <w:rPr>
+          <w:rFonts w:ascii="Nirmala UI" w:hAnsi="Nirmala UI" w:cs="Nirmala UI"/>
+        </w:rPr>
+        <w:t>তাদের</w:t>
+      </w:r>
+      <w:r>
+        <w:rPr>
+          <w:lang w:val="pt-PT"/>
+        </w:rPr>
+        <w:t xml:space="preserve"> </w:t>
+      </w:r>
+      <w:r>
+        <w:rPr>
+          <w:rFonts w:ascii="Nirmala UI" w:hAnsi="Nirmala UI" w:cs="Nirmala UI"/>
+        </w:rPr>
+        <w:t>ফরম্যাট</w:t>
+      </w:r>
+      <w:r>
+        <w:rPr>
+          <w:lang w:val="pt-PT"/>
+        </w:rPr>
+        <w:t xml:space="preserve"> </w:t>
+      </w:r>
+      <w:r>
+        <w:rPr>
+          <w:rFonts w:ascii="Nirmala UI" w:hAnsi="Nirmala UI" w:cs="Nirmala UI"/>
+        </w:rPr>
+        <w:t>কেমন</w:t>
+      </w:r>
+      <w:r>
+        <w:rPr>
+          <w:lang w:val="pt-PT"/>
+        </w:rPr>
+        <w:t xml:space="preserve"> </w:t>
+      </w:r>
+      <w:r>
+        <w:rPr>
+          <w:rFonts w:ascii="Nirmala UI" w:hAnsi="Nirmala UI" w:cs="Nirmala UI"/>
+        </w:rPr>
+        <w:t>হবে।</w:t>
+      </w:r>
+    </w:p>
+    <w:p>
+      <w:pPr>
+        <w:numPr>
+          <w:ilvl w:val="0"/>
+          <w:numId w:val="2"/>
+        </w:numPr>
+        <w:rPr>
+          <w:lang w:val="pt-PT"/>
+        </w:rPr>
+      </w:pPr>
+      <w:r>
+        <w:rPr>
+          <w:rFonts w:ascii="Nirmala UI" w:hAnsi="Nirmala UI" w:cs="Nirmala UI"/>
+          <w:b/>
+          <w:bCs/>
+        </w:rPr>
+        <w:t>কেন</w:t>
+      </w:r>
+      <w:r>
+        <w:rPr>
+          <w:b/>
+          <w:bCs/>
+          <w:lang w:val="pt-PT"/>
+        </w:rPr>
+        <w:t xml:space="preserve"> </w:t>
+      </w:r>
+      <w:r>
+        <w:rPr>
+          <w:rFonts w:ascii="Nirmala UI" w:hAnsi="Nirmala UI" w:cs="Nirmala UI"/>
+          <w:b/>
+          <w:bCs/>
+        </w:rPr>
+        <w:t>ব্যবহার</w:t>
+      </w:r>
+      <w:r>
+        <w:rPr>
+          <w:b/>
+          <w:bCs/>
+          <w:lang w:val="pt-PT"/>
+        </w:rPr>
+        <w:t xml:space="preserve"> </w:t>
+      </w:r>
+      <w:r>
+        <w:rPr>
+          <w:rFonts w:ascii="Nirmala UI" w:hAnsi="Nirmala UI" w:cs="Nirmala UI"/>
+          <w:b/>
+          <w:bCs/>
+        </w:rPr>
+        <w:t>করা</w:t>
+      </w:r>
+      <w:r>
+        <w:rPr>
+          <w:b/>
+          <w:bCs/>
+          <w:lang w:val="pt-PT"/>
+        </w:rPr>
+        <w:t xml:space="preserve"> </w:t>
+      </w:r>
+      <w:r>
+        <w:rPr>
+          <w:rFonts w:ascii="Nirmala UI" w:hAnsi="Nirmala UI" w:cs="Nirmala UI"/>
+          <w:b/>
+          <w:bCs/>
+        </w:rPr>
+        <w:t>হয়</w:t>
+      </w:r>
+      <w:r>
+        <w:rPr>
+          <w:b/>
+          <w:bCs/>
+          <w:lang w:val="pt-PT"/>
+        </w:rPr>
+        <w:t>?</w:t>
+      </w:r>
+      <w:r>
+        <w:rPr>
+          <w:lang w:val="pt-PT"/>
+        </w:rPr>
+        <w:t xml:space="preserve"> </w:t>
+      </w:r>
+      <w:r>
+        <w:rPr>
+          <w:rFonts w:ascii="Nirmala UI" w:hAnsi="Nirmala UI" w:cs="Nirmala UI"/>
+        </w:rPr>
+        <w:t>যখন</w:t>
+      </w:r>
+      <w:r>
+        <w:rPr>
+          <w:lang w:val="pt-PT"/>
+        </w:rPr>
+        <w:t xml:space="preserve"> </w:t>
+      </w:r>
+      <w:r>
+        <w:rPr>
+          <w:rFonts w:ascii="Nirmala UI" w:hAnsi="Nirmala UI" w:cs="Nirmala UI"/>
+        </w:rPr>
+        <w:t>ক্লায়েন্ট</w:t>
+      </w:r>
+      <w:r>
+        <w:rPr>
+          <w:lang w:val="pt-PT"/>
+        </w:rPr>
+        <w:t xml:space="preserve"> (</w:t>
+      </w:r>
+      <w:r>
+        <w:rPr>
+          <w:rFonts w:ascii="Nirmala UI" w:hAnsi="Nirmala UI" w:cs="Nirmala UI"/>
+        </w:rPr>
+        <w:t>যেমন</w:t>
+      </w:r>
+      <w:r>
+        <w:rPr>
+          <w:lang w:val="pt-PT"/>
+        </w:rPr>
+        <w:t xml:space="preserve">: </w:t>
+      </w:r>
+      <w:r>
+        <w:rPr>
+          <w:rFonts w:ascii="Nirmala UI" w:hAnsi="Nirmala UI" w:cs="Nirmala UI"/>
+        </w:rPr>
+        <w:t>ব্রাউজার</w:t>
+      </w:r>
+      <w:r>
+        <w:rPr>
+          <w:lang w:val="pt-PT"/>
+        </w:rPr>
+        <w:t xml:space="preserve"> </w:t>
+      </w:r>
+      <w:r>
+        <w:rPr>
+          <w:rFonts w:ascii="Nirmala UI" w:hAnsi="Nirmala UI" w:cs="Nirmala UI"/>
+        </w:rPr>
+        <w:t>বা</w:t>
+      </w:r>
+      <w:r>
+        <w:rPr>
+          <w:lang w:val="pt-PT"/>
+        </w:rPr>
+        <w:t xml:space="preserve"> </w:t>
+      </w:r>
+      <w:r>
+        <w:rPr>
+          <w:rFonts w:ascii="Nirmala UI" w:hAnsi="Nirmala UI" w:cs="Nirmala UI"/>
+        </w:rPr>
+        <w:t>মোবাইল</w:t>
+      </w:r>
+      <w:r>
+        <w:rPr>
+          <w:lang w:val="pt-PT"/>
+        </w:rPr>
+        <w:t xml:space="preserve"> </w:t>
+      </w:r>
+      <w:r>
+        <w:rPr>
+          <w:rFonts w:ascii="Nirmala UI" w:hAnsi="Nirmala UI" w:cs="Nirmala UI"/>
+        </w:rPr>
+        <w:t>অ্যাপ</w:t>
+      </w:r>
+      <w:r>
+        <w:rPr>
+          <w:lang w:val="pt-PT"/>
+        </w:rPr>
+        <w:t xml:space="preserve">) </w:t>
+      </w:r>
+      <w:r>
+        <w:rPr>
+          <w:rFonts w:ascii="Nirmala UI" w:hAnsi="Nirmala UI" w:cs="Nirmala UI"/>
+        </w:rPr>
+        <w:t>সার্ভারে</w:t>
+      </w:r>
+      <w:r>
+        <w:rPr>
+          <w:lang w:val="pt-PT"/>
+        </w:rPr>
+        <w:t xml:space="preserve"> </w:t>
+      </w:r>
+      <w:r>
+        <w:rPr>
+          <w:rFonts w:ascii="Nirmala UI" w:hAnsi="Nirmala UI" w:cs="Nirmala UI"/>
+        </w:rPr>
+        <w:t>ডাটা</w:t>
+      </w:r>
+      <w:r>
+        <w:rPr>
+          <w:lang w:val="pt-PT"/>
+        </w:rPr>
+        <w:t xml:space="preserve"> </w:t>
+      </w:r>
+      <w:r>
+        <w:rPr>
+          <w:rFonts w:ascii="Nirmala UI" w:hAnsi="Nirmala UI" w:cs="Nirmala UI"/>
+        </w:rPr>
+        <w:t>পাঠায়</w:t>
+      </w:r>
+      <w:r>
+        <w:rPr>
+          <w:lang w:val="pt-PT"/>
+        </w:rPr>
+        <w:t xml:space="preserve"> (</w:t>
+      </w:r>
+      <w:r>
+        <w:rPr>
+          <w:rFonts w:ascii="Nirmala UI" w:hAnsi="Nirmala UI" w:cs="Nirmala UI"/>
+        </w:rPr>
+        <w:t>যেমন</w:t>
+      </w:r>
+      <w:r>
+        <w:rPr>
+          <w:lang w:val="pt-PT"/>
+        </w:rPr>
+        <w:t xml:space="preserve">: </w:t>
+      </w:r>
+      <w:r>
+        <w:rPr>
+          <w:rFonts w:ascii="Nirmala UI" w:hAnsi="Nirmala UI" w:cs="Nirmala UI"/>
+        </w:rPr>
+        <w:t>রেজিস্ট্রেশন</w:t>
+      </w:r>
+      <w:r>
+        <w:rPr>
+          <w:lang w:val="pt-PT"/>
+        </w:rPr>
+        <w:t xml:space="preserve"> </w:t>
+      </w:r>
+      <w:r>
+        <w:rPr>
+          <w:rFonts w:ascii="Nirmala UI" w:hAnsi="Nirmala UI" w:cs="Nirmala UI"/>
+        </w:rPr>
+        <w:t>ফর্ম</w:t>
+      </w:r>
+      <w:r>
+        <w:rPr>
+          <w:lang w:val="pt-PT"/>
+        </w:rPr>
+        <w:t xml:space="preserve">), </w:t>
+      </w:r>
+      <w:r>
+        <w:rPr>
+          <w:rFonts w:ascii="Nirmala UI" w:hAnsi="Nirmala UI" w:cs="Nirmala UI"/>
+        </w:rPr>
+        <w:t>তখন</w:t>
+      </w:r>
+      <w:r>
+        <w:rPr>
+          <w:lang w:val="pt-PT"/>
+        </w:rPr>
+        <w:t xml:space="preserve"> </w:t>
+      </w:r>
+      <w:r>
+        <w:rPr>
+          <w:rFonts w:ascii="Nirmala UI" w:hAnsi="Nirmala UI" w:cs="Nirmala UI"/>
+        </w:rPr>
+        <w:t>সার্ভারকে</w:t>
+      </w:r>
+      <w:r>
+        <w:rPr>
+          <w:lang w:val="pt-PT"/>
+        </w:rPr>
+        <w:t xml:space="preserve"> </w:t>
+      </w:r>
+      <w:r>
+        <w:rPr>
+          <w:rFonts w:ascii="Nirmala UI" w:hAnsi="Nirmala UI" w:cs="Nirmala UI"/>
+        </w:rPr>
+        <w:t>জানতে</w:t>
+      </w:r>
+      <w:r>
+        <w:rPr>
+          <w:lang w:val="pt-PT"/>
+        </w:rPr>
+        <w:t xml:space="preserve"> </w:t>
+      </w:r>
+      <w:r>
+        <w:rPr>
+          <w:rFonts w:ascii="Nirmala UI" w:hAnsi="Nirmala UI" w:cs="Nirmala UI"/>
+        </w:rPr>
+        <w:t>হয়</w:t>
+      </w:r>
+      <w:r>
+        <w:rPr>
+          <w:lang w:val="pt-PT"/>
+        </w:rPr>
+        <w:t xml:space="preserve"> </w:t>
+      </w:r>
+      <w:r>
+        <w:rPr>
+          <w:rFonts w:ascii="Nirmala UI" w:hAnsi="Nirmala UI" w:cs="Nirmala UI"/>
+        </w:rPr>
+        <w:t>ঠিক</w:t>
+      </w:r>
+      <w:r>
+        <w:rPr>
+          <w:lang w:val="pt-PT"/>
+        </w:rPr>
+        <w:t xml:space="preserve"> </w:t>
+      </w:r>
+      <w:r>
+        <w:rPr>
+          <w:rFonts w:ascii="Nirmala UI" w:hAnsi="Nirmala UI" w:cs="Nirmala UI"/>
+        </w:rPr>
+        <w:t>কোন</w:t>
+      </w:r>
+      <w:r>
+        <w:rPr>
+          <w:lang w:val="pt-PT"/>
+        </w:rPr>
+        <w:t xml:space="preserve"> </w:t>
+      </w:r>
+      <w:r>
+        <w:rPr>
+          <w:rFonts w:ascii="Nirmala UI" w:hAnsi="Nirmala UI" w:cs="Nirmala UI"/>
+        </w:rPr>
+        <w:t>কোন</w:t>
+      </w:r>
+      <w:r>
+        <w:rPr>
+          <w:lang w:val="pt-PT"/>
+        </w:rPr>
+        <w:t xml:space="preserve"> </w:t>
+      </w:r>
+      <w:r>
+        <w:rPr>
+          <w:rFonts w:ascii="Nirmala UI" w:hAnsi="Nirmala UI" w:cs="Nirmala UI"/>
+        </w:rPr>
+        <w:t>ফিল্ডগুলো</w:t>
+      </w:r>
+      <w:r>
+        <w:rPr>
+          <w:lang w:val="pt-PT"/>
+        </w:rPr>
+        <w:t xml:space="preserve"> </w:t>
+      </w:r>
+      <w:r>
+        <w:rPr>
+          <w:rFonts w:ascii="Nirmala UI" w:hAnsi="Nirmala UI" w:cs="Nirmala UI"/>
+        </w:rPr>
+        <w:t>আসবে।</w:t>
+      </w:r>
+    </w:p>
+    <w:p>
+      <w:pPr>
+        <w:numPr>
+          <w:ilvl w:val="0"/>
+          <w:numId w:val="2"/>
+        </w:numPr>
+        <w:rPr>
+          <w:lang w:val="pt-PT"/>
+        </w:rPr>
+      </w:pPr>
+      <w:r>
+        <w:rPr>
+          <w:rFonts w:ascii="Nirmala UI" w:hAnsi="Nirmala UI" w:cs="Nirmala UI"/>
+          <w:b/>
+          <w:bCs/>
+        </w:rPr>
+        <w:t>কাজ</w:t>
+      </w:r>
+      <w:r>
+        <w:rPr>
+          <w:b/>
+          <w:bCs/>
+          <w:lang w:val="pt-PT"/>
+        </w:rPr>
+        <w:t>:</w:t>
+      </w:r>
+      <w:r>
+        <w:rPr>
+          <w:lang w:val="pt-PT"/>
+        </w:rPr>
+        <w:t xml:space="preserve"> </w:t>
+      </w:r>
+      <w:r>
+        <w:rPr>
+          <w:rFonts w:ascii="Nirmala UI" w:hAnsi="Nirmala UI" w:cs="Nirmala UI"/>
+        </w:rPr>
+        <w:t>এটি</w:t>
+      </w:r>
+      <w:r>
+        <w:rPr>
+          <w:lang w:val="pt-PT"/>
+        </w:rPr>
+        <w:t xml:space="preserve"> </w:t>
+      </w:r>
+      <w:r>
+        <w:rPr>
+          <w:rFonts w:ascii="Nirmala UI" w:hAnsi="Nirmala UI" w:cs="Nirmala UI"/>
+        </w:rPr>
+        <w:t>ডাটার</w:t>
+      </w:r>
+      <w:r>
+        <w:rPr>
+          <w:lang w:val="pt-PT"/>
+        </w:rPr>
+        <w:t xml:space="preserve"> </w:t>
+      </w:r>
+      <w:r>
+        <w:rPr>
+          <w:rFonts w:ascii="Nirmala UI" w:hAnsi="Nirmala UI" w:cs="Nirmala UI"/>
+        </w:rPr>
+        <w:t>একটি</w:t>
+      </w:r>
+      <w:r>
+        <w:rPr>
+          <w:lang w:val="pt-PT"/>
+        </w:rPr>
+        <w:t xml:space="preserve"> "</w:t>
+      </w:r>
+      <w:r>
+        <w:rPr>
+          <w:rFonts w:ascii="Nirmala UI" w:hAnsi="Nirmala UI" w:cs="Nirmala UI"/>
+        </w:rPr>
+        <w:t>ব্লু</w:t>
+      </w:r>
+      <w:r>
+        <w:rPr>
+          <w:lang w:val="pt-PT"/>
+        </w:rPr>
+        <w:t>-</w:t>
+      </w:r>
+      <w:r>
+        <w:rPr>
+          <w:rFonts w:ascii="Nirmala UI" w:hAnsi="Nirmala UI" w:cs="Nirmala UI"/>
+        </w:rPr>
+        <w:t>প্রিন্ট</w:t>
+      </w:r>
+      <w:r>
+        <w:rPr>
+          <w:lang w:val="pt-PT"/>
+        </w:rPr>
+        <w:t xml:space="preserve">" </w:t>
+      </w:r>
+      <w:r>
+        <w:rPr>
+          <w:rFonts w:ascii="Nirmala UI" w:hAnsi="Nirmala UI" w:cs="Nirmala UI"/>
+        </w:rPr>
+        <w:t>বা</w:t>
+      </w:r>
+      <w:r>
+        <w:rPr>
+          <w:lang w:val="pt-PT"/>
+        </w:rPr>
+        <w:t xml:space="preserve"> "</w:t>
+      </w:r>
+      <w:r>
+        <w:rPr>
+          <w:rFonts w:ascii="Nirmala UI" w:hAnsi="Nirmala UI" w:cs="Nirmala UI"/>
+        </w:rPr>
+        <w:t>ম্যাপ</w:t>
+      </w:r>
+      <w:r>
+        <w:rPr>
+          <w:lang w:val="pt-PT"/>
+        </w:rPr>
+        <w:t xml:space="preserve">" </w:t>
+      </w:r>
+      <w:r>
+        <w:rPr>
+          <w:rFonts w:ascii="Nirmala UI" w:hAnsi="Nirmala UI" w:cs="Nirmala UI"/>
+        </w:rPr>
+        <w:t>হিসেবে</w:t>
+      </w:r>
+      <w:r>
+        <w:rPr>
+          <w:lang w:val="pt-PT"/>
+        </w:rPr>
+        <w:t xml:space="preserve"> </w:t>
+      </w:r>
+      <w:r>
+        <w:rPr>
+          <w:rFonts w:ascii="Nirmala UI" w:hAnsi="Nirmala UI" w:cs="Nirmala UI"/>
+        </w:rPr>
+        <w:t>কাজ</w:t>
+      </w:r>
+      <w:r>
+        <w:rPr>
+          <w:lang w:val="pt-PT"/>
+        </w:rPr>
+        <w:t xml:space="preserve"> </w:t>
+      </w:r>
+      <w:r>
+        <w:rPr>
+          <w:rFonts w:ascii="Nirmala UI" w:hAnsi="Nirmala UI" w:cs="Nirmala UI"/>
+        </w:rPr>
+        <w:t>করে।</w:t>
+      </w:r>
+    </w:p>
+    <w:p>
+      <w:r>
+        <w:pict w14:anchorId="732DF532">
+          <v:rect id="_x0000_i1061" style="width:0;height:1.5pt" o:hralign="center" o:hrstd="t" o:hrnoshade="t" o:hr="t" fillcolor="gray" stroked="f"/>
+        </w:pict>
+      </w:r>
+    </w:p>
+    <w:p>
+      <w:pPr>
+        <w:rPr>
+          <w:b/>
+          <w:bCs/>
+        </w:rPr>
+      </w:pPr>
+      <w:r>
+        <w:rPr>
+          <w:rFonts w:ascii="Nirmala UI" w:hAnsi="Nirmala UI" w:cs="Nirmala UI"/>
+          <w:b/>
+          <w:bCs/>
+        </w:rPr>
+        <w:t>২</w:t>
+      </w:r>
+      <w:r>
+        <w:rPr>
+          <w:b/>
+          <w:bCs/>
+        </w:rPr>
+        <w:t xml:space="preserve">. class-validator </w:t>
+      </w:r>
+      <w:r>
+        <w:rPr>
+          <w:rFonts w:ascii="Nirmala UI" w:hAnsi="Nirmala UI" w:cs="Nirmala UI"/>
+          <w:b/>
+          <w:bCs/>
+        </w:rPr>
+        <w:t>কি</w:t>
+      </w:r>
+      <w:r>
+        <w:rPr>
+          <w:b/>
+          <w:bCs/>
+        </w:rPr>
+        <w:t>?</w:t>
+      </w:r>
+    </w:p>
+    <w:p>
+      <w:r>
+        <w:rPr>
+          <w:rFonts w:ascii="Nirmala UI" w:hAnsi="Nirmala UI" w:cs="Nirmala UI"/>
+        </w:rPr>
+        <w:t>এটি</w:t>
+      </w:r>
+      <w:r>
+        <w:t xml:space="preserve"> </w:t>
+      </w:r>
+      <w:r>
+        <w:rPr>
+          <w:rFonts w:ascii="Nirmala UI" w:hAnsi="Nirmala UI" w:cs="Nirmala UI"/>
+        </w:rPr>
+        <w:t>একটি</w:t>
+      </w:r>
+      <w:r>
+        <w:t xml:space="preserve"> </w:t>
+      </w:r>
+      <w:r>
+        <w:rPr>
+          <w:rFonts w:ascii="Nirmala UI" w:hAnsi="Nirmala UI" w:cs="Nirmala UI"/>
+        </w:rPr>
+        <w:t>লাইব্রেরি</w:t>
+      </w:r>
+      <w:r>
+        <w:t xml:space="preserve"> </w:t>
+      </w:r>
+      <w:r>
+        <w:rPr>
+          <w:rFonts w:ascii="Nirmala UI" w:hAnsi="Nirmala UI" w:cs="Nirmala UI"/>
+        </w:rPr>
+        <w:t>যা</w:t>
+      </w:r>
+      <w:r>
+        <w:t xml:space="preserve"> DTO-</w:t>
+      </w:r>
+      <w:r>
+        <w:rPr>
+          <w:rFonts w:ascii="Nirmala UI" w:hAnsi="Nirmala UI" w:cs="Nirmala UI"/>
+        </w:rPr>
+        <w:t>এর</w:t>
+      </w:r>
+      <w:r>
+        <w:t xml:space="preserve"> </w:t>
+      </w:r>
+      <w:r>
+        <w:rPr>
+          <w:rFonts w:ascii="Nirmala UI" w:hAnsi="Nirmala UI" w:cs="Nirmala UI"/>
+        </w:rPr>
+        <w:t>ফিল্ডগুলোকে</w:t>
+      </w:r>
+      <w:r>
+        <w:t xml:space="preserve"> </w:t>
+      </w:r>
+      <w:r>
+        <w:rPr>
+          <w:rFonts w:ascii="Nirmala UI" w:hAnsi="Nirmala UI" w:cs="Nirmala UI"/>
+          <w:b/>
+          <w:bCs/>
+        </w:rPr>
+        <w:t>ভ্যালিডেশন</w:t>
+      </w:r>
+      <w:r>
+        <w:t xml:space="preserve"> </w:t>
+      </w:r>
+      <w:r>
+        <w:rPr>
+          <w:rFonts w:ascii="Nirmala UI" w:hAnsi="Nirmala UI" w:cs="Nirmala UI"/>
+        </w:rPr>
+        <w:t>করতে</w:t>
+      </w:r>
+      <w:r>
+        <w:t xml:space="preserve"> </w:t>
+      </w:r>
+      <w:r>
+        <w:rPr>
+          <w:rFonts w:ascii="Nirmala UI" w:hAnsi="Nirmala UI" w:cs="Nirmala UI"/>
+        </w:rPr>
+        <w:t>সাহায্য</w:t>
+      </w:r>
+      <w:r>
+        <w:t xml:space="preserve"> </w:t>
+      </w:r>
+      <w:r>
+        <w:rPr>
+          <w:rFonts w:ascii="Nirmala UI" w:hAnsi="Nirmala UI" w:cs="Nirmala UI"/>
+        </w:rPr>
+        <w:t>করে।</w:t>
+      </w:r>
+    </w:p>
+    <w:p>
+      <w:pPr>
+        <w:numPr>
+          <w:ilvl w:val="0"/>
+          <w:numId w:val="3"/>
+        </w:numPr>
+      </w:pPr>
+      <w:r>
+        <w:rPr>
+          <w:rFonts w:ascii="Nirmala UI" w:hAnsi="Nirmala UI" w:cs="Nirmala UI"/>
+          <w:b/>
+          <w:bCs/>
+        </w:rPr>
+        <w:t>কেন</w:t>
+      </w:r>
+      <w:r>
+        <w:rPr>
+          <w:b/>
+          <w:bCs/>
+        </w:rPr>
+        <w:t xml:space="preserve"> </w:t>
+      </w:r>
+      <w:r>
+        <w:rPr>
+          <w:rFonts w:ascii="Nirmala UI" w:hAnsi="Nirmala UI" w:cs="Nirmala UI"/>
+          <w:b/>
+          <w:bCs/>
+        </w:rPr>
+        <w:t>ব্যবহার</w:t>
+      </w:r>
+      <w:r>
+        <w:rPr>
+          <w:b/>
+          <w:bCs/>
+        </w:rPr>
+        <w:t xml:space="preserve"> </w:t>
+      </w:r>
+      <w:r>
+        <w:rPr>
+          <w:rFonts w:ascii="Nirmala UI" w:hAnsi="Nirmala UI" w:cs="Nirmala UI"/>
+          <w:b/>
+          <w:bCs/>
+        </w:rPr>
+        <w:t>করা</w:t>
+      </w:r>
+      <w:r>
+        <w:rPr>
+          <w:b/>
+          <w:bCs/>
+        </w:rPr>
+        <w:t xml:space="preserve"> </w:t>
+      </w:r>
+      <w:r>
+        <w:rPr>
+          <w:rFonts w:ascii="Nirmala UI" w:hAnsi="Nirmala UI" w:cs="Nirmala UI"/>
+          <w:b/>
+          <w:bCs/>
+        </w:rPr>
+        <w:t>হয়</w:t>
+      </w:r>
+      <w:r>
+        <w:rPr>
+          <w:b/>
+          <w:bCs/>
+        </w:rPr>
+        <w:t>?</w:t>
+      </w:r>
+      <w:r>
+        <w:t xml:space="preserve"> </w:t>
+      </w:r>
+      <w:r>
+        <w:rPr>
+          <w:rFonts w:ascii="Nirmala UI" w:hAnsi="Nirmala UI" w:cs="Nirmala UI"/>
+        </w:rPr>
+        <w:t>ইউজার</w:t>
+      </w:r>
+      <w:r>
+        <w:t xml:space="preserve"> </w:t>
+      </w:r>
+      <w:r>
+        <w:rPr>
+          <w:rFonts w:ascii="Nirmala UI" w:hAnsi="Nirmala UI" w:cs="Nirmala UI"/>
+        </w:rPr>
+        <w:t>হয়তো</w:t>
+      </w:r>
+      <w:r>
+        <w:t xml:space="preserve"> </w:t>
+      </w:r>
+      <w:r>
+        <w:rPr>
+          <w:rFonts w:ascii="Nirmala UI" w:hAnsi="Nirmala UI" w:cs="Nirmala UI"/>
+        </w:rPr>
+        <w:t>ইমেইল</w:t>
+      </w:r>
+      <w:r>
+        <w:t xml:space="preserve"> </w:t>
+      </w:r>
+      <w:r>
+        <w:rPr>
+          <w:rFonts w:ascii="Nirmala UI" w:hAnsi="Nirmala UI" w:cs="Nirmala UI"/>
+        </w:rPr>
+        <w:t>ফিল্ডে</w:t>
+      </w:r>
+      <w:r>
+        <w:t xml:space="preserve"> </w:t>
+      </w:r>
+      <w:r>
+        <w:rPr>
+          <w:rFonts w:ascii="Nirmala UI" w:hAnsi="Nirmala UI" w:cs="Nirmala UI"/>
+        </w:rPr>
+        <w:t>ইমেইল</w:t>
+      </w:r>
+      <w:r>
+        <w:t xml:space="preserve"> </w:t>
+      </w:r>
+      <w:r>
+        <w:rPr>
+          <w:rFonts w:ascii="Nirmala UI" w:hAnsi="Nirmala UI" w:cs="Nirmala UI"/>
+        </w:rPr>
+        <w:t>না</w:t>
+      </w:r>
+      <w:r>
+        <w:t xml:space="preserve"> </w:t>
+      </w:r>
+      <w:r>
+        <w:rPr>
+          <w:rFonts w:ascii="Nirmala UI" w:hAnsi="Nirmala UI" w:cs="Nirmala UI"/>
+        </w:rPr>
+        <w:t>দিয়ে</w:t>
+      </w:r>
+      <w:r>
+        <w:t xml:space="preserve"> </w:t>
+      </w:r>
+      <w:r>
+        <w:rPr>
+          <w:rFonts w:ascii="Nirmala UI" w:hAnsi="Nirmala UI" w:cs="Nirmala UI"/>
+        </w:rPr>
+        <w:t>শুধু</w:t>
+      </w:r>
+      <w:r>
+        <w:t xml:space="preserve"> </w:t>
+      </w:r>
+      <w:r>
+        <w:rPr>
+          <w:rFonts w:ascii="Nirmala UI" w:hAnsi="Nirmala UI" w:cs="Nirmala UI"/>
+        </w:rPr>
+        <w:t>নাম</w:t>
+      </w:r>
+      <w:r>
+        <w:t xml:space="preserve"> </w:t>
+      </w:r>
+      <w:r>
+        <w:rPr>
+          <w:rFonts w:ascii="Nirmala UI" w:hAnsi="Nirmala UI" w:cs="Nirmala UI"/>
+        </w:rPr>
+        <w:t>লিখে</w:t>
+      </w:r>
+      <w:r>
+        <w:t xml:space="preserve"> </w:t>
+      </w:r>
+      <w:r>
+        <w:rPr>
+          <w:rFonts w:ascii="Nirmala UI" w:hAnsi="Nirmala UI" w:cs="Nirmala UI"/>
+        </w:rPr>
+        <w:t>দিলো</w:t>
+      </w:r>
+      <w:r>
+        <w:t xml:space="preserve">, </w:t>
+      </w:r>
+      <w:r>
+        <w:rPr>
+          <w:rFonts w:ascii="Nirmala UI" w:hAnsi="Nirmala UI" w:cs="Nirmala UI"/>
+        </w:rPr>
+        <w:t>অথবা</w:t>
+      </w:r>
+      <w:r>
+        <w:t xml:space="preserve"> </w:t>
+      </w:r>
+      <w:r>
+        <w:rPr>
+          <w:rFonts w:ascii="Nirmala UI" w:hAnsi="Nirmala UI" w:cs="Nirmala UI"/>
+        </w:rPr>
+        <w:t>পাসওয়ার্ড</w:t>
+      </w:r>
+      <w:r>
+        <w:t xml:space="preserve"> </w:t>
+      </w:r>
+      <w:r>
+        <w:rPr>
+          <w:rFonts w:ascii="Nirmala UI" w:hAnsi="Nirmala UI" w:cs="Nirmala UI"/>
+        </w:rPr>
+        <w:t>খুব</w:t>
+      </w:r>
+      <w:r>
+        <w:t xml:space="preserve"> </w:t>
+      </w:r>
+      <w:r>
+        <w:rPr>
+          <w:rFonts w:ascii="Nirmala UI" w:hAnsi="Nirmala UI" w:cs="Nirmala UI"/>
+        </w:rPr>
+        <w:t>ছোট</w:t>
+      </w:r>
+      <w:r>
+        <w:t xml:space="preserve"> </w:t>
+      </w:r>
+      <w:r>
+        <w:rPr>
+          <w:rFonts w:ascii="Nirmala UI" w:hAnsi="Nirmala UI" w:cs="Nirmala UI"/>
+        </w:rPr>
+        <w:t>দিলো।</w:t>
+      </w:r>
+      <w:r>
+        <w:t xml:space="preserve"> </w:t>
+      </w:r>
+      <w:r>
+        <w:rPr>
+          <w:rFonts w:ascii="Nirmala UI" w:hAnsi="Nirmala UI" w:cs="Nirmala UI"/>
+        </w:rPr>
+        <w:t>এই</w:t>
+      </w:r>
+      <w:r>
+        <w:t xml:space="preserve"> </w:t>
+      </w:r>
+      <w:r>
+        <w:rPr>
+          <w:rFonts w:ascii="Nirmala UI" w:hAnsi="Nirmala UI" w:cs="Nirmala UI"/>
+        </w:rPr>
+        <w:t>ভুলগুলো</w:t>
+      </w:r>
+      <w:r>
+        <w:t xml:space="preserve"> </w:t>
+      </w:r>
+      <w:r>
+        <w:rPr>
+          <w:rFonts w:ascii="Nirmala UI" w:hAnsi="Nirmala UI" w:cs="Nirmala UI"/>
+        </w:rPr>
+        <w:t>ধরার</w:t>
+      </w:r>
+      <w:r>
+        <w:t xml:space="preserve"> </w:t>
+      </w:r>
+      <w:r>
+        <w:rPr>
+          <w:rFonts w:ascii="Nirmala UI" w:hAnsi="Nirmala UI" w:cs="Nirmala UI"/>
+        </w:rPr>
+        <w:t>জন্য</w:t>
+      </w:r>
+      <w:r>
+        <w:t xml:space="preserve"> </w:t>
+      </w:r>
+      <w:r>
+        <w:rPr>
+          <w:rFonts w:ascii="Nirmala UI" w:hAnsi="Nirmala UI" w:cs="Nirmala UI"/>
+        </w:rPr>
+        <w:t>এটি</w:t>
+      </w:r>
+      <w:r>
+        <w:t xml:space="preserve"> </w:t>
+      </w:r>
+      <w:r>
+        <w:rPr>
+          <w:rFonts w:ascii="Nirmala UI" w:hAnsi="Nirmala UI" w:cs="Nirmala UI"/>
+        </w:rPr>
+        <w:t>ব্যবহার</w:t>
+      </w:r>
+      <w:r>
+        <w:t xml:space="preserve"> </w:t>
+      </w:r>
+      <w:r>
+        <w:rPr>
+          <w:rFonts w:ascii="Nirmala UI" w:hAnsi="Nirmala UI" w:cs="Nirmala UI"/>
+        </w:rPr>
+        <w:t>করা</w:t>
+      </w:r>
+      <w:r>
+        <w:t xml:space="preserve"> </w:t>
+      </w:r>
+      <w:r>
+        <w:rPr>
+          <w:rFonts w:ascii="Nirmala UI" w:hAnsi="Nirmala UI" w:cs="Nirmala UI"/>
+        </w:rPr>
+        <w:t>হয়।</w:t>
+      </w:r>
+    </w:p>
+    <w:p>
+      <w:pPr>
+        <w:numPr>
+          <w:ilvl w:val="0"/>
+          <w:numId w:val="3"/>
+        </w:numPr>
+      </w:pPr>
+      <w:r>
+        <w:rPr>
+          <w:rFonts w:ascii="Nirmala UI" w:hAnsi="Nirmala UI" w:cs="Nirmala UI"/>
+          <w:b/>
+          <w:bCs/>
+        </w:rPr>
+        <w:t>কাজ</w:t>
+      </w:r>
+      <w:r>
+        <w:rPr>
+          <w:b/>
+          <w:bCs/>
+        </w:rPr>
+        <w:t>:</w:t>
+      </w:r>
+      <w:r>
+        <w:t xml:space="preserve"> </w:t>
+      </w:r>
+      <w:r>
+        <w:rPr>
+          <w:rFonts w:ascii="Nirmala UI" w:hAnsi="Nirmala UI" w:cs="Nirmala UI"/>
+        </w:rPr>
+        <w:t>এটি</w:t>
+      </w:r>
+      <w:r>
+        <w:t xml:space="preserve"> </w:t>
+      </w:r>
+      <w:r>
+        <w:rPr>
+          <w:rFonts w:ascii="Nirmala UI" w:hAnsi="Nirmala UI" w:cs="Nirmala UI"/>
+        </w:rPr>
+        <w:t>ডেকোরেটর</w:t>
+      </w:r>
+      <w:r>
+        <w:t xml:space="preserve"> (</w:t>
+      </w:r>
+      <w:r>
+        <w:rPr>
+          <w:rFonts w:ascii="Nirmala UI" w:hAnsi="Nirmala UI" w:cs="Nirmala UI"/>
+        </w:rPr>
+        <w:t>যেমন</w:t>
+      </w:r>
+      <w:r>
+        <w:t xml:space="preserve">: @IsEmail(), @MinLength()) </w:t>
+      </w:r>
+      <w:r>
+        <w:rPr>
+          <w:rFonts w:ascii="Nirmala UI" w:hAnsi="Nirmala UI" w:cs="Nirmala UI"/>
+        </w:rPr>
+        <w:t>ব্যবহার</w:t>
+      </w:r>
+      <w:r>
+        <w:t xml:space="preserve"> </w:t>
+      </w:r>
+      <w:r>
+        <w:rPr>
+          <w:rFonts w:ascii="Nirmala UI" w:hAnsi="Nirmala UI" w:cs="Nirmala UI"/>
+        </w:rPr>
+        <w:t>করে</w:t>
+      </w:r>
+      <w:r>
+        <w:t xml:space="preserve"> </w:t>
+      </w:r>
+      <w:r>
+        <w:rPr>
+          <w:rFonts w:ascii="Nirmala UI" w:hAnsi="Nirmala UI" w:cs="Nirmala UI"/>
+        </w:rPr>
+        <w:t>ডাটা</w:t>
+      </w:r>
+      <w:r>
+        <w:t xml:space="preserve"> </w:t>
+      </w:r>
+      <w:r>
+        <w:rPr>
+          <w:rFonts w:ascii="Nirmala UI" w:hAnsi="Nirmala UI" w:cs="Nirmala UI"/>
+        </w:rPr>
+        <w:t>চেক</w:t>
+      </w:r>
+      <w:r>
+        <w:t xml:space="preserve"> </w:t>
+      </w:r>
+      <w:r>
+        <w:rPr>
+          <w:rFonts w:ascii="Nirmala UI" w:hAnsi="Nirmala UI" w:cs="Nirmala UI"/>
+        </w:rPr>
+        <w:t>করে।</w:t>
+      </w:r>
+    </w:p>
+    <w:p/>
+    <w:p>
+      <w:pPr>
+        <w:rPr>
+          <w:b/>
+          <w:bCs/>
+        </w:rPr>
+      </w:pPr>
+      <w:r>
+        <w:rPr>
+          <w:b/>
+          <w:bCs/>
+        </w:rPr>
+        <w:t>GitHub:</w:t>
+      </w:r>
+      <w:r>
+        <w:rPr>
+          <w:b/>
+          <w:bCs/>
+        </w:rPr>
+        <w:t xml:space="preserve"> </w:t>
+      </w:r>
+      <w:r>
+        <w:rPr>
+          <w:b/>
+          <w:bCs/>
+        </w:rPr>
+        <w:t>https://github.com/typestack/class-validator</w:t>
+      </w:r>
+    </w:p>
+    <w:p>
+      <w:r>
+        <w:pict w14:anchorId="45247015">
+          <v:rect id="_x0000_i1062" style="width:0;height:1.5pt" o:hralign="center" o:hrstd="t" o:hrnoshade="t" o:hr="t" fillcolor="gray" stroked="f"/>
+        </w:pict>
+      </w:r>
+    </w:p>
+    <w:p>
+      <w:pPr>
+        <w:rPr>
+          <w:b/>
+          <w:bCs/>
+        </w:rPr>
+      </w:pPr>
+      <w:r>
+        <w:rPr>
+          <w:rFonts w:ascii="Nirmala UI" w:hAnsi="Nirmala UI" w:cs="Nirmala UI"/>
+          <w:b/>
+          <w:bCs/>
+        </w:rPr>
+        <w:t>৩</w:t>
+      </w:r>
+      <w:r>
+        <w:rPr>
+          <w:b/>
+          <w:bCs/>
+        </w:rPr>
+        <w:t xml:space="preserve">. class-transformer </w:t>
+      </w:r>
+      <w:r>
+        <w:rPr>
+          <w:rFonts w:ascii="Nirmala UI" w:hAnsi="Nirmala UI" w:cs="Nirmala UI"/>
+          <w:b/>
+          <w:bCs/>
+        </w:rPr>
+        <w:t>কি</w:t>
+      </w:r>
+      <w:r>
+        <w:rPr>
+          <w:b/>
+          <w:bCs/>
+        </w:rPr>
+        <w:t>?</w:t>
+      </w:r>
+    </w:p>
+    <w:p>
+      <w:r>
+        <w:rPr>
+          <w:rFonts w:ascii="Nirmala UI" w:hAnsi="Nirmala UI" w:cs="Nirmala UI"/>
+        </w:rPr>
+        <w:t>এটি</w:t>
+      </w:r>
+      <w:r>
+        <w:t xml:space="preserve"> </w:t>
+      </w:r>
+      <w:r>
+        <w:rPr>
+          <w:rFonts w:ascii="Nirmala UI" w:hAnsi="Nirmala UI" w:cs="Nirmala UI"/>
+        </w:rPr>
+        <w:t>একটি</w:t>
+      </w:r>
+      <w:r>
+        <w:t xml:space="preserve"> </w:t>
+      </w:r>
+      <w:r>
+        <w:rPr>
+          <w:rFonts w:ascii="Nirmala UI" w:hAnsi="Nirmala UI" w:cs="Nirmala UI"/>
+        </w:rPr>
+        <w:t>লাইব্রেরি</w:t>
+      </w:r>
+      <w:r>
+        <w:t xml:space="preserve"> </w:t>
+      </w:r>
+      <w:r>
+        <w:rPr>
+          <w:rFonts w:ascii="Nirmala UI" w:hAnsi="Nirmala UI" w:cs="Nirmala UI"/>
+        </w:rPr>
+        <w:t>যা</w:t>
+      </w:r>
+      <w:r>
+        <w:t xml:space="preserve"> </w:t>
+      </w:r>
+      <w:r>
+        <w:rPr>
+          <w:rFonts w:ascii="Nirmala UI" w:hAnsi="Nirmala UI" w:cs="Nirmala UI"/>
+        </w:rPr>
+        <w:t>প্লেইন</w:t>
+      </w:r>
+      <w:r>
+        <w:t xml:space="preserve"> </w:t>
+      </w:r>
+      <w:r>
+        <w:rPr>
+          <w:rFonts w:ascii="Nirmala UI" w:hAnsi="Nirmala UI" w:cs="Nirmala UI"/>
+        </w:rPr>
+        <w:t>অবজেক্টকে</w:t>
+      </w:r>
+      <w:r>
+        <w:t xml:space="preserve"> (Plain JavaScript Object) </w:t>
+      </w:r>
+      <w:r>
+        <w:rPr>
+          <w:rFonts w:ascii="Nirmala UI" w:hAnsi="Nirmala UI" w:cs="Nirmala UI"/>
+        </w:rPr>
+        <w:t>ক্লাস</w:t>
+      </w:r>
+      <w:r>
+        <w:t xml:space="preserve"> </w:t>
+      </w:r>
+      <w:r>
+        <w:rPr>
+          <w:rFonts w:ascii="Nirmala UI" w:hAnsi="Nirmala UI" w:cs="Nirmala UI"/>
+        </w:rPr>
+        <w:t>অবজেক্টে</w:t>
+      </w:r>
+      <w:r>
+        <w:t xml:space="preserve"> (Class Instance) </w:t>
+      </w:r>
+      <w:r>
+        <w:rPr>
+          <w:rFonts w:ascii="Nirmala UI" w:hAnsi="Nirmala UI" w:cs="Nirmala UI"/>
+        </w:rPr>
+        <w:t>রূপান্তর</w:t>
+      </w:r>
+      <w:r>
+        <w:t xml:space="preserve"> </w:t>
+      </w:r>
+      <w:r>
+        <w:rPr>
+          <w:rFonts w:ascii="Nirmala UI" w:hAnsi="Nirmala UI" w:cs="Nirmala UI"/>
+        </w:rPr>
+        <w:t>করে।</w:t>
+      </w:r>
+    </w:p>
+    <w:p>
+      <w:pPr>
+        <w:numPr>
+          <w:ilvl w:val="0"/>
+          <w:numId w:val="4"/>
+        </w:numPr>
+      </w:pPr>
+      <w:r>
+        <w:rPr>
+          <w:rFonts w:ascii="Nirmala UI" w:hAnsi="Nirmala UI" w:cs="Nirmala UI"/>
+          <w:b/>
+          <w:bCs/>
+        </w:rPr>
+        <w:t>কেন</w:t>
+      </w:r>
+      <w:r>
+        <w:rPr>
+          <w:b/>
+          <w:bCs/>
+        </w:rPr>
+        <w:t xml:space="preserve"> </w:t>
+      </w:r>
+      <w:r>
+        <w:rPr>
+          <w:rFonts w:ascii="Nirmala UI" w:hAnsi="Nirmala UI" w:cs="Nirmala UI"/>
+          <w:b/>
+          <w:bCs/>
+        </w:rPr>
+        <w:t>ব্যবহার</w:t>
+      </w:r>
+      <w:r>
+        <w:rPr>
+          <w:b/>
+          <w:bCs/>
+        </w:rPr>
+        <w:t xml:space="preserve"> </w:t>
+      </w:r>
+      <w:r>
+        <w:rPr>
+          <w:rFonts w:ascii="Nirmala UI" w:hAnsi="Nirmala UI" w:cs="Nirmala UI"/>
+          <w:b/>
+          <w:bCs/>
+        </w:rPr>
+        <w:t>করা</w:t>
+      </w:r>
+      <w:r>
+        <w:rPr>
+          <w:b/>
+          <w:bCs/>
+        </w:rPr>
+        <w:t xml:space="preserve"> </w:t>
+      </w:r>
+      <w:r>
+        <w:rPr>
+          <w:rFonts w:ascii="Nirmala UI" w:hAnsi="Nirmala UI" w:cs="Nirmala UI"/>
+          <w:b/>
+          <w:bCs/>
+        </w:rPr>
+        <w:t>হয়</w:t>
+      </w:r>
+      <w:r>
+        <w:rPr>
+          <w:b/>
+          <w:bCs/>
+        </w:rPr>
+        <w:t>?</w:t>
+      </w:r>
+      <w:r>
+        <w:t xml:space="preserve"> </w:t>
+      </w:r>
+      <w:r>
+        <w:rPr>
+          <w:rFonts w:ascii="Nirmala UI" w:hAnsi="Nirmala UI" w:cs="Nirmala UI"/>
+        </w:rPr>
+        <w:t>নেটওয়ার্ক</w:t>
+      </w:r>
+      <w:r>
+        <w:t xml:space="preserve"> </w:t>
+      </w:r>
+      <w:r>
+        <w:rPr>
+          <w:rFonts w:ascii="Nirmala UI" w:hAnsi="Nirmala UI" w:cs="Nirmala UI"/>
+        </w:rPr>
+        <w:t>থেকে</w:t>
+      </w:r>
+      <w:r>
+        <w:t xml:space="preserve"> </w:t>
+      </w:r>
+      <w:r>
+        <w:rPr>
+          <w:rFonts w:ascii="Nirmala UI" w:hAnsi="Nirmala UI" w:cs="Nirmala UI"/>
+        </w:rPr>
+        <w:t>আসা</w:t>
+      </w:r>
+      <w:r>
+        <w:t xml:space="preserve"> </w:t>
+      </w:r>
+      <w:r>
+        <w:rPr>
+          <w:rFonts w:ascii="Nirmala UI" w:hAnsi="Nirmala UI" w:cs="Nirmala UI"/>
+        </w:rPr>
+        <w:t>ডাটা</w:t>
+      </w:r>
+      <w:r>
+        <w:t xml:space="preserve"> </w:t>
+      </w:r>
+      <w:r>
+        <w:rPr>
+          <w:rFonts w:ascii="Nirmala UI" w:hAnsi="Nirmala UI" w:cs="Nirmala UI"/>
+        </w:rPr>
+        <w:t>সবসময়</w:t>
+      </w:r>
+      <w:r>
+        <w:t xml:space="preserve"> </w:t>
+      </w:r>
+      <w:r>
+        <w:rPr>
+          <w:rFonts w:ascii="Nirmala UI" w:hAnsi="Nirmala UI" w:cs="Nirmala UI"/>
+        </w:rPr>
+        <w:t>সাধারণ</w:t>
+      </w:r>
+      <w:r>
+        <w:t xml:space="preserve"> JSON </w:t>
+      </w:r>
+      <w:r>
+        <w:rPr>
+          <w:rFonts w:ascii="Nirmala UI" w:hAnsi="Nirmala UI" w:cs="Nirmala UI"/>
+        </w:rPr>
+        <w:t>বা</w:t>
+      </w:r>
+      <w:r>
+        <w:t xml:space="preserve"> Object </w:t>
+      </w:r>
+      <w:r>
+        <w:rPr>
+          <w:rFonts w:ascii="Nirmala UI" w:hAnsi="Nirmala UI" w:cs="Nirmala UI"/>
+        </w:rPr>
+        <w:t>হিসেবে</w:t>
+      </w:r>
+      <w:r>
+        <w:t xml:space="preserve"> </w:t>
+      </w:r>
+      <w:r>
+        <w:rPr>
+          <w:rFonts w:ascii="Nirmala UI" w:hAnsi="Nirmala UI" w:cs="Nirmala UI"/>
+        </w:rPr>
+        <w:t>আসে।</w:t>
+      </w:r>
+      <w:r>
+        <w:t xml:space="preserve"> </w:t>
+      </w:r>
+      <w:r>
+        <w:rPr>
+          <w:rFonts w:ascii="Nirmala UI" w:hAnsi="Nirmala UI" w:cs="Nirmala UI"/>
+        </w:rPr>
+        <w:t>কিন্তু</w:t>
+      </w:r>
+      <w:r>
+        <w:t xml:space="preserve"> NestJS-</w:t>
+      </w:r>
+      <w:r>
+        <w:rPr>
+          <w:rFonts w:ascii="Nirmala UI" w:hAnsi="Nirmala UI" w:cs="Nirmala UI"/>
+        </w:rPr>
+        <w:t>এ</w:t>
+      </w:r>
+      <w:r>
+        <w:t xml:space="preserve"> </w:t>
+      </w:r>
+      <w:r>
+        <w:rPr>
+          <w:rFonts w:ascii="Nirmala UI" w:hAnsi="Nirmala UI" w:cs="Nirmala UI"/>
+        </w:rPr>
+        <w:t>ডিটিও</w:t>
+      </w:r>
+      <w:r>
+        <w:t>-</w:t>
+      </w:r>
+      <w:r>
+        <w:rPr>
+          <w:rFonts w:ascii="Nirmala UI" w:hAnsi="Nirmala UI" w:cs="Nirmala UI"/>
+        </w:rPr>
+        <w:t>এর</w:t>
+      </w:r>
+      <w:r>
+        <w:t xml:space="preserve"> </w:t>
+      </w:r>
+      <w:r>
+        <w:rPr>
+          <w:rFonts w:ascii="Nirmala UI" w:hAnsi="Nirmala UI" w:cs="Nirmala UI"/>
+        </w:rPr>
+        <w:t>পাওয়ার</w:t>
+      </w:r>
+      <w:r>
+        <w:t xml:space="preserve"> (</w:t>
+      </w:r>
+      <w:r>
+        <w:rPr>
+          <w:rFonts w:ascii="Nirmala UI" w:hAnsi="Nirmala UI" w:cs="Nirmala UI"/>
+        </w:rPr>
+        <w:t>যেমন</w:t>
+      </w:r>
+      <w:r>
+        <w:t xml:space="preserve">: </w:t>
+      </w:r>
+      <w:r>
+        <w:rPr>
+          <w:rFonts w:ascii="Nirmala UI" w:hAnsi="Nirmala UI" w:cs="Nirmala UI"/>
+        </w:rPr>
+        <w:t>মেথড</w:t>
+      </w:r>
+      <w:r>
+        <w:t xml:space="preserve"> </w:t>
+      </w:r>
+      <w:r>
+        <w:rPr>
+          <w:rFonts w:ascii="Nirmala UI" w:hAnsi="Nirmala UI" w:cs="Nirmala UI"/>
+        </w:rPr>
+        <w:t>বা</w:t>
+      </w:r>
+      <w:r>
+        <w:t xml:space="preserve"> </w:t>
+      </w:r>
+      <w:r>
+        <w:rPr>
+          <w:rFonts w:ascii="Nirmala UI" w:hAnsi="Nirmala UI" w:cs="Nirmala UI"/>
+        </w:rPr>
+        <w:t>টাইপ</w:t>
+      </w:r>
+      <w:r>
+        <w:t xml:space="preserve"> </w:t>
+      </w:r>
+      <w:r>
+        <w:rPr>
+          <w:rFonts w:ascii="Nirmala UI" w:hAnsi="Nirmala UI" w:cs="Nirmala UI"/>
+        </w:rPr>
+        <w:t>কাস্টিং</w:t>
+      </w:r>
+      <w:r>
+        <w:t xml:space="preserve">) </w:t>
+      </w:r>
+      <w:r>
+        <w:rPr>
+          <w:rFonts w:ascii="Nirmala UI" w:hAnsi="Nirmala UI" w:cs="Nirmala UI"/>
+        </w:rPr>
+        <w:t>ব্যবহার</w:t>
+      </w:r>
+      <w:r>
+        <w:t xml:space="preserve"> </w:t>
+      </w:r>
+      <w:r>
+        <w:rPr>
+          <w:rFonts w:ascii="Nirmala UI" w:hAnsi="Nirmala UI" w:cs="Nirmala UI"/>
+        </w:rPr>
+        <w:t>করতে</w:t>
+      </w:r>
+      <w:r>
+        <w:t xml:space="preserve"> </w:t>
+      </w:r>
+      <w:r>
+        <w:rPr>
+          <w:rFonts w:ascii="Nirmala UI" w:hAnsi="Nirmala UI" w:cs="Nirmala UI"/>
+        </w:rPr>
+        <w:t>হলে</w:t>
+      </w:r>
+      <w:r>
+        <w:t xml:space="preserve"> </w:t>
+      </w:r>
+      <w:r>
+        <w:rPr>
+          <w:rFonts w:ascii="Nirmala UI" w:hAnsi="Nirmala UI" w:cs="Nirmala UI"/>
+        </w:rPr>
+        <w:t>তাকে</w:t>
+      </w:r>
+      <w:r>
+        <w:t xml:space="preserve"> </w:t>
+      </w:r>
+      <w:r>
+        <w:rPr>
+          <w:rFonts w:ascii="Nirmala UI" w:hAnsi="Nirmala UI" w:cs="Nirmala UI"/>
+        </w:rPr>
+        <w:t>ক্লাসে</w:t>
+      </w:r>
+      <w:r>
+        <w:t xml:space="preserve"> </w:t>
+      </w:r>
+      <w:r>
+        <w:rPr>
+          <w:rFonts w:ascii="Nirmala UI" w:hAnsi="Nirmala UI" w:cs="Nirmala UI"/>
+        </w:rPr>
+        <w:t>রূপান্তর</w:t>
+      </w:r>
+      <w:r>
+        <w:t xml:space="preserve"> </w:t>
+      </w:r>
+      <w:r>
+        <w:rPr>
+          <w:rFonts w:ascii="Nirmala UI" w:hAnsi="Nirmala UI" w:cs="Nirmala UI"/>
+        </w:rPr>
+        <w:t>করতে</w:t>
+      </w:r>
+      <w:r>
+        <w:t xml:space="preserve"> </w:t>
+      </w:r>
+      <w:r>
+        <w:rPr>
+          <w:rFonts w:ascii="Nirmala UI" w:hAnsi="Nirmala UI" w:cs="Nirmala UI"/>
+        </w:rPr>
+        <w:t>হয়।</w:t>
+      </w:r>
+    </w:p>
+    <w:p>
+      <w:pPr>
+        <w:numPr>
+          <w:ilvl w:val="0"/>
+          <w:numId w:val="4"/>
+        </w:numPr>
+      </w:pPr>
+      <w:r>
+        <w:rPr>
+          <w:rFonts w:ascii="Nirmala UI" w:hAnsi="Nirmala UI" w:cs="Nirmala UI"/>
+          <w:b/>
+          <w:bCs/>
+        </w:rPr>
+        <w:lastRenderedPageBreak/>
+        <w:t>কাজ</w:t>
+      </w:r>
+      <w:r>
+        <w:rPr>
+          <w:b/>
+          <w:bCs/>
+        </w:rPr>
+        <w:t>:</w:t>
+      </w:r>
+      <w:r>
+        <w:t xml:space="preserve"> </w:t>
+      </w:r>
+      <w:r>
+        <w:rPr>
+          <w:rFonts w:ascii="Nirmala UI" w:hAnsi="Nirmala UI" w:cs="Nirmala UI"/>
+        </w:rPr>
+        <w:t>এটি</w:t>
+      </w:r>
+      <w:r>
+        <w:t xml:space="preserve"> </w:t>
+      </w:r>
+      <w:r>
+        <w:rPr>
+          <w:rFonts w:ascii="Nirmala UI" w:hAnsi="Nirmala UI" w:cs="Nirmala UI"/>
+        </w:rPr>
+        <w:t>ডাটাকে</w:t>
+      </w:r>
+      <w:r>
+        <w:t xml:space="preserve"> </w:t>
+      </w:r>
+      <w:r>
+        <w:rPr>
+          <w:rFonts w:ascii="Nirmala UI" w:hAnsi="Nirmala UI" w:cs="Nirmala UI"/>
+        </w:rPr>
+        <w:t>এক</w:t>
+      </w:r>
+      <w:r>
+        <w:t xml:space="preserve"> </w:t>
+      </w:r>
+      <w:r>
+        <w:rPr>
+          <w:rFonts w:ascii="Nirmala UI" w:hAnsi="Nirmala UI" w:cs="Nirmala UI"/>
+        </w:rPr>
+        <w:t>ফরম্যাট</w:t>
+      </w:r>
+      <w:r>
+        <w:t xml:space="preserve"> </w:t>
+      </w:r>
+      <w:r>
+        <w:rPr>
+          <w:rFonts w:ascii="Nirmala UI" w:hAnsi="Nirmala UI" w:cs="Nirmala UI"/>
+        </w:rPr>
+        <w:t>থেকে</w:t>
+      </w:r>
+      <w:r>
+        <w:t xml:space="preserve"> </w:t>
+      </w:r>
+      <w:r>
+        <w:rPr>
+          <w:rFonts w:ascii="Nirmala UI" w:hAnsi="Nirmala UI" w:cs="Nirmala UI"/>
+        </w:rPr>
+        <w:t>অন্য</w:t>
+      </w:r>
+      <w:r>
+        <w:t xml:space="preserve"> </w:t>
+      </w:r>
+      <w:r>
+        <w:rPr>
+          <w:rFonts w:ascii="Nirmala UI" w:hAnsi="Nirmala UI" w:cs="Nirmala UI"/>
+        </w:rPr>
+        <w:t>ফরম্যাটে</w:t>
+      </w:r>
+      <w:r>
+        <w:t xml:space="preserve"> </w:t>
+      </w:r>
+      <w:r>
+        <w:rPr>
+          <w:rFonts w:ascii="Nirmala UI" w:hAnsi="Nirmala UI" w:cs="Nirmala UI"/>
+        </w:rPr>
+        <w:t>রূপান্তর</w:t>
+      </w:r>
+      <w:r>
+        <w:t xml:space="preserve"> (Transform) </w:t>
+      </w:r>
+      <w:r>
+        <w:rPr>
+          <w:rFonts w:ascii="Nirmala UI" w:hAnsi="Nirmala UI" w:cs="Nirmala UI"/>
+        </w:rPr>
+        <w:t>করে।</w:t>
+      </w:r>
+      <w:r>
+        <w:t xml:space="preserve"> </w:t>
+      </w:r>
+      <w:r>
+        <w:rPr>
+          <w:rFonts w:ascii="Nirmala UI" w:hAnsi="Nirmala UI" w:cs="Nirmala UI"/>
+        </w:rPr>
+        <w:t>যেমন</w:t>
+      </w:r>
+      <w:r>
+        <w:t xml:space="preserve">: </w:t>
+      </w:r>
+      <w:r>
+        <w:rPr>
+          <w:rFonts w:ascii="Nirmala UI" w:hAnsi="Nirmala UI" w:cs="Nirmala UI"/>
+        </w:rPr>
+        <w:t>স্ট্রিংকে</w:t>
+      </w:r>
+      <w:r>
+        <w:t xml:space="preserve"> </w:t>
+      </w:r>
+      <w:r>
+        <w:rPr>
+          <w:rFonts w:ascii="Nirmala UI" w:hAnsi="Nirmala UI" w:cs="Nirmala UI"/>
+        </w:rPr>
+        <w:t>ডেট</w:t>
+      </w:r>
+      <w:r>
+        <w:t xml:space="preserve"> (Date) </w:t>
+      </w:r>
+      <w:r>
+        <w:rPr>
+          <w:rFonts w:ascii="Nirmala UI" w:hAnsi="Nirmala UI" w:cs="Nirmala UI"/>
+        </w:rPr>
+        <w:t>অবজেক্টে</w:t>
+      </w:r>
+      <w:r>
+        <w:t xml:space="preserve"> </w:t>
+      </w:r>
+      <w:r>
+        <w:rPr>
+          <w:rFonts w:ascii="Nirmala UI" w:hAnsi="Nirmala UI" w:cs="Nirmala UI"/>
+        </w:rPr>
+        <w:t>বদলে</w:t>
+      </w:r>
+      <w:r>
+        <w:t xml:space="preserve"> </w:t>
+      </w:r>
+      <w:r>
+        <w:rPr>
+          <w:rFonts w:ascii="Nirmala UI" w:hAnsi="Nirmala UI" w:cs="Nirmala UI"/>
+        </w:rPr>
+        <w:t>দেওয়া।</w:t>
+      </w:r>
+    </w:p>
+    <w:p>
+      <w:r>
+        <w:pict w14:anchorId="21ECA548">
+          <v:rect id="_x0000_i1063" style="width:0;height:1.5pt" o:hralign="center" o:hrstd="t" o:hrnoshade="t" o:hr="t" fillcolor="gray" stroked="f"/>
+        </w:pict>
+      </w:r>
+    </w:p>
+    <w:p>
+      <w:pPr>
+        <w:rPr>
+          <w:b/>
+          <w:bCs/>
+        </w:rPr>
+      </w:pPr>
+      <w:r>
+        <w:rPr>
+          <w:rFonts w:ascii="Nirmala UI" w:hAnsi="Nirmala UI" w:cs="Nirmala UI"/>
+          <w:b/>
+          <w:bCs/>
+        </w:rPr>
+        <w:t>উদাহরণ</w:t>
+      </w:r>
+      <w:r>
+        <w:rPr>
+          <w:b/>
+          <w:bCs/>
+        </w:rPr>
+        <w:t xml:space="preserve">: </w:t>
+      </w:r>
+      <w:r>
+        <w:rPr>
+          <w:rFonts w:ascii="Nirmala UI" w:hAnsi="Nirmala UI" w:cs="Nirmala UI"/>
+          <w:b/>
+          <w:bCs/>
+        </w:rPr>
+        <w:t>সবগুলোকে</w:t>
+      </w:r>
+      <w:r>
+        <w:rPr>
+          <w:b/>
+          <w:bCs/>
+        </w:rPr>
+        <w:t xml:space="preserve"> </w:t>
+      </w:r>
+      <w:r>
+        <w:rPr>
+          <w:rFonts w:ascii="Nirmala UI" w:hAnsi="Nirmala UI" w:cs="Nirmala UI"/>
+          <w:b/>
+          <w:bCs/>
+        </w:rPr>
+        <w:t>একসাথে</w:t>
+      </w:r>
+      <w:r>
+        <w:rPr>
+          <w:b/>
+          <w:bCs/>
+        </w:rPr>
+        <w:t xml:space="preserve"> </w:t>
+      </w:r>
+      <w:r>
+        <w:rPr>
+          <w:rFonts w:ascii="Nirmala UI" w:hAnsi="Nirmala UI" w:cs="Nirmala UI"/>
+          <w:b/>
+          <w:bCs/>
+        </w:rPr>
+        <w:t>দেখলে</w:t>
+      </w:r>
+      <w:r>
+        <w:rPr>
+          <w:b/>
+          <w:bCs/>
+        </w:rPr>
+        <w:t xml:space="preserve"> </w:t>
+      </w:r>
+      <w:r>
+        <w:rPr>
+          <w:rFonts w:ascii="Nirmala UI" w:hAnsi="Nirmala UI" w:cs="Nirmala UI"/>
+          <w:b/>
+          <w:bCs/>
+        </w:rPr>
+        <w:t>কেমন</w:t>
+      </w:r>
+      <w:r>
+        <w:rPr>
+          <w:b/>
+          <w:bCs/>
+        </w:rPr>
+        <w:t xml:space="preserve"> </w:t>
+      </w:r>
+      <w:r>
+        <w:rPr>
+          <w:rFonts w:ascii="Nirmala UI" w:hAnsi="Nirmala UI" w:cs="Nirmala UI"/>
+          <w:b/>
+          <w:bCs/>
+        </w:rPr>
+        <w:t>লাগবে</w:t>
+      </w:r>
+      <w:r>
+        <w:rPr>
+          <w:b/>
+          <w:bCs/>
+        </w:rPr>
+        <w:t>?</w:t>
+      </w:r>
+    </w:p>
+    <w:p>
+      <w:r>
+        <w:rPr>
+          <w:rFonts w:ascii="Nirmala UI" w:hAnsi="Nirmala UI" w:cs="Nirmala UI"/>
+        </w:rPr>
+        <w:t>প্রথমে</w:t>
+      </w:r>
+      <w:r>
+        <w:t xml:space="preserve"> </w:t>
+      </w:r>
+      <w:r>
+        <w:rPr>
+          <w:rFonts w:ascii="Nirmala UI" w:hAnsi="Nirmala UI" w:cs="Nirmala UI"/>
+        </w:rPr>
+        <w:t>লাইব্রেরি</w:t>
+      </w:r>
+      <w:r>
+        <w:t xml:space="preserve"> </w:t>
+      </w:r>
+      <w:r>
+        <w:rPr>
+          <w:rFonts w:ascii="Nirmala UI" w:hAnsi="Nirmala UI" w:cs="Nirmala UI"/>
+        </w:rPr>
+        <w:t>দুটি</w:t>
+      </w:r>
+      <w:r>
+        <w:t xml:space="preserve"> </w:t>
+      </w:r>
+      <w:r>
+        <w:rPr>
+          <w:rFonts w:ascii="Nirmala UI" w:hAnsi="Nirmala UI" w:cs="Nirmala UI"/>
+        </w:rPr>
+        <w:t>ইন্সটল</w:t>
+      </w:r>
+      <w:r>
+        <w:t xml:space="preserve"> </w:t>
+      </w:r>
+      <w:r>
+        <w:rPr>
+          <w:rFonts w:ascii="Nirmala UI" w:hAnsi="Nirmala UI" w:cs="Nirmala UI"/>
+        </w:rPr>
+        <w:t>করতে</w:t>
+      </w:r>
+      <w:r>
+        <w:t xml:space="preserve"> </w:t>
+      </w:r>
+      <w:r>
+        <w:rPr>
+          <w:rFonts w:ascii="Nirmala UI" w:hAnsi="Nirmala UI" w:cs="Nirmala UI"/>
+        </w:rPr>
+        <w:t>হয়</w:t>
+      </w:r>
+      <w:r>
+        <w:t>: npm i class-validator class-transformer</w:t>
+      </w:r>
+    </w:p>
+    <w:p>
+      <w:pPr>
+        <w:rPr>
+          <w:b/>
+          <w:bCs/>
+        </w:rPr>
+      </w:pPr>
+      <w:r>
+        <w:rPr>
+          <w:rFonts w:ascii="Nirmala UI" w:hAnsi="Nirmala UI" w:cs="Nirmala UI"/>
+          <w:b/>
+          <w:bCs/>
+        </w:rPr>
+        <w:t>ধাপ</w:t>
+      </w:r>
+      <w:r>
+        <w:rPr>
+          <w:b/>
+          <w:bCs/>
+        </w:rPr>
+        <w:t xml:space="preserve"> </w:t>
+      </w:r>
+      <w:r>
+        <w:rPr>
+          <w:rFonts w:ascii="Nirmala UI" w:hAnsi="Nirmala UI" w:cs="Nirmala UI"/>
+          <w:b/>
+          <w:bCs/>
+        </w:rPr>
+        <w:t>১</w:t>
+      </w:r>
+      <w:r>
+        <w:rPr>
+          <w:b/>
+          <w:bCs/>
+        </w:rPr>
+        <w:t xml:space="preserve">: DTO </w:t>
+      </w:r>
+      <w:r>
+        <w:rPr>
+          <w:rFonts w:ascii="Nirmala UI" w:hAnsi="Nirmala UI" w:cs="Nirmala UI"/>
+          <w:b/>
+          <w:bCs/>
+        </w:rPr>
+        <w:t>তৈরি</w:t>
+      </w:r>
+      <w:r>
+        <w:rPr>
+          <w:b/>
+          <w:bCs/>
+        </w:rPr>
+        <w:t xml:space="preserve"> </w:t>
+      </w:r>
+      <w:r>
+        <w:rPr>
+          <w:rFonts w:ascii="Nirmala UI" w:hAnsi="Nirmala UI" w:cs="Nirmala UI"/>
+          <w:b/>
+          <w:bCs/>
+        </w:rPr>
+        <w:t>করা</w:t>
+      </w:r>
+      <w:r>
+        <w:rPr>
+          <w:b/>
+          <w:bCs/>
+        </w:rPr>
+        <w:t xml:space="preserve"> (</w:t>
+      </w:r>
+      <w:r>
+        <w:rPr>
+          <w:rFonts w:ascii="Nirmala UI" w:hAnsi="Nirmala UI" w:cs="Nirmala UI"/>
+          <w:b/>
+          <w:bCs/>
+        </w:rPr>
+        <w:t>ইউজার</w:t>
+      </w:r>
+      <w:r>
+        <w:rPr>
+          <w:b/>
+          <w:bCs/>
+        </w:rPr>
+        <w:t xml:space="preserve"> </w:t>
+      </w:r>
+      <w:r>
+        <w:rPr>
+          <w:rFonts w:ascii="Nirmala UI" w:hAnsi="Nirmala UI" w:cs="Nirmala UI"/>
+          <w:b/>
+          <w:bCs/>
+        </w:rPr>
+        <w:t>রেজিস্ট্রেশনের</w:t>
+      </w:r>
+      <w:r>
+        <w:rPr>
+          <w:b/>
+          <w:bCs/>
+        </w:rPr>
+        <w:t xml:space="preserve"> </w:t>
+      </w:r>
+      <w:r>
+        <w:rPr>
+          <w:rFonts w:ascii="Nirmala UI" w:hAnsi="Nirmala UI" w:cs="Nirmala UI"/>
+          <w:b/>
+          <w:bCs/>
+        </w:rPr>
+        <w:t>জন্য</w:t>
+      </w:r>
+      <w:r>
+        <w:rPr>
+          <w:b/>
+          <w:bCs/>
+        </w:rPr>
+        <w:t>)</w:t>
+      </w:r>
+    </w:p>
+    <w:p>
+      <w:r>
+        <w:t>TypeScript</w:t>
+      </w:r>
+    </w:p>
+    <w:p>
+      <w:r>
+        <w:t>import { IsEmail, IsString, MinLength } from 'class-validator';</w:t>
+      </w:r>
+    </w:p>
+    <w:p/>
+    <w:p>
+      <w:r>
+        <w:t>export class CreateUserDto {</w:t>
+      </w:r>
+    </w:p>
+    <w:p>
+      <w:r>
+        <w:t xml:space="preserve">  @IsString()</w:t>
+      </w:r>
+    </w:p>
+    <w:p>
+      <w:r>
+        <w:t xml:space="preserve">  name: string;</w:t>
+      </w:r>
+    </w:p>
+    <w:p/>
+    <w:p>
+      <w:r>
+        <w:t xml:space="preserve">  @IsEmail({}, { message: '</w:t>
+      </w:r>
+      <w:r>
+        <w:rPr>
+          <w:rFonts w:ascii="Nirmala UI" w:hAnsi="Nirmala UI" w:cs="Nirmala UI"/>
+        </w:rPr>
+        <w:t>সঠিক</w:t>
+      </w:r>
+      <w:r>
+        <w:t xml:space="preserve"> </w:t>
+      </w:r>
+      <w:r>
+        <w:rPr>
+          <w:rFonts w:ascii="Nirmala UI" w:hAnsi="Nirmala UI" w:cs="Nirmala UI"/>
+        </w:rPr>
+        <w:t>ইমেইল</w:t>
+      </w:r>
+      <w:r>
+        <w:t xml:space="preserve"> </w:t>
+      </w:r>
+      <w:r>
+        <w:rPr>
+          <w:rFonts w:ascii="Nirmala UI" w:hAnsi="Nirmala UI" w:cs="Nirmala UI"/>
+        </w:rPr>
+        <w:t>দিন</w:t>
+      </w:r>
+      <w:r>
+        <w:t>!' })</w:t>
+      </w:r>
+    </w:p>
+    <w:p>
+      <w:r>
+        <w:t xml:space="preserve">  email: string;</w:t>
+      </w:r>
+    </w:p>
+    <w:p/>
+    <w:p>
+      <w:r>
+        <w:t xml:space="preserve">  @MinLength(6, { message: '</w:t>
+      </w:r>
+      <w:r>
+        <w:rPr>
+          <w:rFonts w:ascii="Nirmala UI" w:hAnsi="Nirmala UI" w:cs="Nirmala UI"/>
+        </w:rPr>
+        <w:t>পাসওয়ার্ড</w:t>
+      </w:r>
+      <w:r>
+        <w:t xml:space="preserve"> </w:t>
+      </w:r>
+      <w:r>
+        <w:rPr>
+          <w:rFonts w:ascii="Nirmala UI" w:hAnsi="Nirmala UI" w:cs="Nirmala UI"/>
+        </w:rPr>
+        <w:t>অন্তত</w:t>
+      </w:r>
+      <w:r>
+        <w:t xml:space="preserve"> </w:t>
+      </w:r>
+      <w:r>
+        <w:rPr>
+          <w:rFonts w:ascii="Nirmala UI" w:hAnsi="Nirmala UI" w:cs="Nirmala UI"/>
+        </w:rPr>
+        <w:t>৬</w:t>
+      </w:r>
+      <w:r>
+        <w:t xml:space="preserve"> </w:t>
+      </w:r>
+      <w:r>
+        <w:rPr>
+          <w:rFonts w:ascii="Nirmala UI" w:hAnsi="Nirmala UI" w:cs="Nirmala UI"/>
+        </w:rPr>
+        <w:t>অক্ষরের</w:t>
+      </w:r>
+      <w:r>
+        <w:t xml:space="preserve"> </w:t>
+      </w:r>
+      <w:r>
+        <w:rPr>
+          <w:rFonts w:ascii="Nirmala UI" w:hAnsi="Nirmala UI" w:cs="Nirmala UI"/>
+        </w:rPr>
+        <w:t>হতে</w:t>
+      </w:r>
+      <w:r>
+        <w:t xml:space="preserve"> </w:t>
+      </w:r>
+      <w:r>
+        <w:rPr>
+          <w:rFonts w:ascii="Nirmala UI" w:hAnsi="Nirmala UI" w:cs="Nirmala UI"/>
+        </w:rPr>
+        <w:t>হবে</w:t>
+      </w:r>
+      <w:r>
+        <w:t>' })</w:t>
+      </w:r>
+    </w:p>
+    <w:p>
+      <w:r>
+        <w:t xml:space="preserve">  password: string;</w:t>
+      </w:r>
+    </w:p>
+    <w:p>
+      <w:r>
+        <w:t>}</w:t>
+      </w:r>
+    </w:p>
+    <w:p>
+      <w:pPr>
+        <w:rPr>
+          <w:b/>
+          <w:bCs/>
+        </w:rPr>
+      </w:pPr>
+      <w:r>
+        <w:rPr>
+          <w:rFonts w:ascii="Nirmala UI" w:hAnsi="Nirmala UI" w:cs="Nirmala UI"/>
+          <w:b/>
+          <w:bCs/>
+        </w:rPr>
+        <w:t>ধাপ</w:t>
+      </w:r>
+      <w:r>
+        <w:rPr>
+          <w:b/>
+          <w:bCs/>
+        </w:rPr>
+        <w:t xml:space="preserve"> </w:t>
+      </w:r>
+      <w:r>
+        <w:rPr>
+          <w:rFonts w:ascii="Nirmala UI" w:hAnsi="Nirmala UI" w:cs="Nirmala UI"/>
+          <w:b/>
+          <w:bCs/>
+        </w:rPr>
+        <w:t>২</w:t>
+      </w:r>
+      <w:r>
+        <w:rPr>
+          <w:b/>
+          <w:bCs/>
+        </w:rPr>
+        <w:t xml:space="preserve">: </w:t>
+      </w:r>
+      <w:r>
+        <w:rPr>
+          <w:rFonts w:ascii="Nirmala UI" w:hAnsi="Nirmala UI" w:cs="Nirmala UI"/>
+          <w:b/>
+          <w:bCs/>
+        </w:rPr>
+        <w:t>মেইন</w:t>
+      </w:r>
+      <w:r>
+        <w:rPr>
+          <w:b/>
+          <w:bCs/>
+        </w:rPr>
+        <w:t xml:space="preserve"> </w:t>
+      </w:r>
+      <w:r>
+        <w:rPr>
+          <w:rFonts w:ascii="Nirmala UI" w:hAnsi="Nirmala UI" w:cs="Nirmala UI"/>
+          <w:b/>
+          <w:bCs/>
+        </w:rPr>
+        <w:t>ফাইলে</w:t>
+      </w:r>
+      <w:r>
+        <w:rPr>
+          <w:b/>
+          <w:bCs/>
+        </w:rPr>
+        <w:t xml:space="preserve"> </w:t>
+      </w:r>
+      <w:r>
+        <w:rPr>
+          <w:rFonts w:ascii="Nirmala UI" w:hAnsi="Nirmala UI" w:cs="Nirmala UI"/>
+          <w:b/>
+          <w:bCs/>
+        </w:rPr>
+        <w:t>পাইপ</w:t>
+      </w:r>
+      <w:r>
+        <w:rPr>
+          <w:b/>
+          <w:bCs/>
+        </w:rPr>
+        <w:t xml:space="preserve"> </w:t>
+      </w:r>
+      <w:r>
+        <w:rPr>
+          <w:rFonts w:ascii="Nirmala UI" w:hAnsi="Nirmala UI" w:cs="Nirmala UI"/>
+          <w:b/>
+          <w:bCs/>
+        </w:rPr>
+        <w:t>সেটআপ</w:t>
+      </w:r>
+      <w:r>
+        <w:rPr>
+          <w:b/>
+          <w:bCs/>
+        </w:rPr>
+        <w:t xml:space="preserve"> </w:t>
+      </w:r>
+      <w:r>
+        <w:rPr>
+          <w:rFonts w:ascii="Nirmala UI" w:hAnsi="Nirmala UI" w:cs="Nirmala UI"/>
+          <w:b/>
+          <w:bCs/>
+        </w:rPr>
+        <w:t>করা</w:t>
+      </w:r>
+    </w:p>
+    <w:p>
+      <w:r>
+        <w:t xml:space="preserve">main.ts </w:t>
+      </w:r>
+      <w:r>
+        <w:rPr>
+          <w:rFonts w:ascii="Nirmala UI" w:hAnsi="Nirmala UI" w:cs="Nirmala UI"/>
+        </w:rPr>
+        <w:t>ফাইলে</w:t>
+      </w:r>
+      <w:r>
+        <w:t xml:space="preserve"> ValidationPipe </w:t>
+      </w:r>
+      <w:r>
+        <w:rPr>
+          <w:rFonts w:ascii="Nirmala UI" w:hAnsi="Nirmala UI" w:cs="Nirmala UI"/>
+        </w:rPr>
+        <w:t>বলে</w:t>
+      </w:r>
+      <w:r>
+        <w:t xml:space="preserve"> </w:t>
+      </w:r>
+      <w:r>
+        <w:rPr>
+          <w:rFonts w:ascii="Nirmala UI" w:hAnsi="Nirmala UI" w:cs="Nirmala UI"/>
+        </w:rPr>
+        <w:t>দিতে</w:t>
+      </w:r>
+      <w:r>
+        <w:t xml:space="preserve"> </w:t>
+      </w:r>
+      <w:r>
+        <w:rPr>
+          <w:rFonts w:ascii="Nirmala UI" w:hAnsi="Nirmala UI" w:cs="Nirmala UI"/>
+        </w:rPr>
+        <w:t>হয়</w:t>
+      </w:r>
+      <w:r>
+        <w:t xml:space="preserve"> </w:t>
+      </w:r>
+      <w:r>
+        <w:rPr>
+          <w:rFonts w:ascii="Nirmala UI" w:hAnsi="Nirmala UI" w:cs="Nirmala UI"/>
+        </w:rPr>
+        <w:t>যাতে</w:t>
+      </w:r>
+      <w:r>
+        <w:t xml:space="preserve"> </w:t>
+      </w:r>
+      <w:r>
+        <w:rPr>
+          <w:rFonts w:ascii="Nirmala UI" w:hAnsi="Nirmala UI" w:cs="Nirmala UI"/>
+        </w:rPr>
+        <w:t>সে</w:t>
+      </w:r>
+      <w:r>
+        <w:t xml:space="preserve"> </w:t>
+      </w:r>
+      <w:r>
+        <w:rPr>
+          <w:rFonts w:ascii="Nirmala UI" w:hAnsi="Nirmala UI" w:cs="Nirmala UI"/>
+        </w:rPr>
+        <w:t>এই</w:t>
+      </w:r>
+      <w:r>
+        <w:t xml:space="preserve"> </w:t>
+      </w:r>
+      <w:r>
+        <w:rPr>
+          <w:rFonts w:ascii="Nirmala UI" w:hAnsi="Nirmala UI" w:cs="Nirmala UI"/>
+        </w:rPr>
+        <w:t>ডেকোরেটরগুলো</w:t>
+      </w:r>
+      <w:r>
+        <w:t xml:space="preserve"> </w:t>
+      </w:r>
+      <w:r>
+        <w:rPr>
+          <w:rFonts w:ascii="Nirmala UI" w:hAnsi="Nirmala UI" w:cs="Nirmala UI"/>
+        </w:rPr>
+        <w:t>দেখে</w:t>
+      </w:r>
+      <w:r>
+        <w:t xml:space="preserve"> </w:t>
+      </w:r>
+      <w:r>
+        <w:rPr>
+          <w:rFonts w:ascii="Nirmala UI" w:hAnsi="Nirmala UI" w:cs="Nirmala UI"/>
+        </w:rPr>
+        <w:t>কাজ</w:t>
+      </w:r>
+      <w:r>
+        <w:t xml:space="preserve"> </w:t>
+      </w:r>
+      <w:r>
+        <w:rPr>
+          <w:rFonts w:ascii="Nirmala UI" w:hAnsi="Nirmala UI" w:cs="Nirmala UI"/>
+        </w:rPr>
+        <w:t>করতে</w:t>
+      </w:r>
+      <w:r>
+        <w:t xml:space="preserve"> </w:t>
+      </w:r>
+      <w:r>
+        <w:rPr>
+          <w:rFonts w:ascii="Nirmala UI" w:hAnsi="Nirmala UI" w:cs="Nirmala UI"/>
+        </w:rPr>
+        <w:t>পারে।</w:t>
+      </w:r>
+    </w:p>
+    <w:p>
+      <w:r>
+        <w:t>TypeScript</w:t>
+      </w:r>
+    </w:p>
+    <w:p>
+      <w:r>
+        <w:t>// main.ts</w:t>
+      </w:r>
+    </w:p>
+    <w:p>
+      <w:r>
+        <w:t>app.useGlobalPipes(new ValidationPipe({</w:t>
+      </w:r>
+    </w:p>
+    <w:p>
+      <w:r>
+        <w:t xml:space="preserve">  whitelist: true, // DTO-</w:t>
+      </w:r>
+      <w:r>
+        <w:rPr>
+          <w:rFonts w:ascii="Nirmala UI" w:hAnsi="Nirmala UI" w:cs="Nirmala UI"/>
+        </w:rPr>
+        <w:t>তে</w:t>
+      </w:r>
+      <w:r>
+        <w:t xml:space="preserve"> </w:t>
+      </w:r>
+      <w:r>
+        <w:rPr>
+          <w:rFonts w:ascii="Nirmala UI" w:hAnsi="Nirmala UI" w:cs="Nirmala UI"/>
+        </w:rPr>
+        <w:t>নেই</w:t>
+      </w:r>
+      <w:r>
+        <w:t xml:space="preserve"> </w:t>
+      </w:r>
+      <w:r>
+        <w:rPr>
+          <w:rFonts w:ascii="Nirmala UI" w:hAnsi="Nirmala UI" w:cs="Nirmala UI"/>
+        </w:rPr>
+        <w:t>এমন</w:t>
+      </w:r>
+      <w:r>
+        <w:t xml:space="preserve"> </w:t>
+      </w:r>
+      <w:r>
+        <w:rPr>
+          <w:rFonts w:ascii="Nirmala UI" w:hAnsi="Nirmala UI" w:cs="Nirmala UI"/>
+        </w:rPr>
+        <w:t>ফালতু</w:t>
+      </w:r>
+      <w:r>
+        <w:t xml:space="preserve"> </w:t>
+      </w:r>
+      <w:r>
+        <w:rPr>
+          <w:rFonts w:ascii="Nirmala UI" w:hAnsi="Nirmala UI" w:cs="Nirmala UI"/>
+        </w:rPr>
+        <w:t>ডাটা</w:t>
+      </w:r>
+      <w:r>
+        <w:t xml:space="preserve"> </w:t>
+      </w:r>
+      <w:r>
+        <w:rPr>
+          <w:rFonts w:ascii="Nirmala UI" w:hAnsi="Nirmala UI" w:cs="Nirmala UI"/>
+        </w:rPr>
+        <w:t>রিমুভ</w:t>
+      </w:r>
+      <w:r>
+        <w:t xml:space="preserve"> </w:t>
+      </w:r>
+      <w:r>
+        <w:rPr>
+          <w:rFonts w:ascii="Nirmala UI" w:hAnsi="Nirmala UI" w:cs="Nirmala UI"/>
+        </w:rPr>
+        <w:t>করে</w:t>
+      </w:r>
+      <w:r>
+        <w:t xml:space="preserve"> </w:t>
+      </w:r>
+      <w:r>
+        <w:rPr>
+          <w:rFonts w:ascii="Nirmala UI" w:hAnsi="Nirmala UI" w:cs="Nirmala UI"/>
+        </w:rPr>
+        <w:t>দিবে</w:t>
+      </w:r>
+    </w:p>
+    <w:p>
+      <w:r>
+        <w:lastRenderedPageBreak/>
+        <w:t xml:space="preserve">  transform: true, // class-transformer </w:t>
+      </w:r>
+      <w:r>
+        <w:rPr>
+          <w:rFonts w:ascii="Nirmala UI" w:hAnsi="Nirmala UI" w:cs="Nirmala UI"/>
+        </w:rPr>
+        <w:t>ব্যবহার</w:t>
+      </w:r>
+      <w:r>
+        <w:t xml:space="preserve"> </w:t>
+      </w:r>
+      <w:r>
+        <w:rPr>
+          <w:rFonts w:ascii="Nirmala UI" w:hAnsi="Nirmala UI" w:cs="Nirmala UI"/>
+        </w:rPr>
+        <w:t>করে</w:t>
+      </w:r>
+      <w:r>
+        <w:t xml:space="preserve"> </w:t>
+      </w:r>
+      <w:r>
+        <w:rPr>
+          <w:rFonts w:ascii="Nirmala UI" w:hAnsi="Nirmala UI" w:cs="Nirmala UI"/>
+        </w:rPr>
+        <w:t>টাইপ</w:t>
+      </w:r>
+      <w:r>
+        <w:t xml:space="preserve"> </w:t>
+      </w:r>
+      <w:r>
+        <w:rPr>
+          <w:rFonts w:ascii="Nirmala UI" w:hAnsi="Nirmala UI" w:cs="Nirmala UI"/>
+        </w:rPr>
+        <w:t>ঠিক</w:t>
+      </w:r>
+      <w:r>
+        <w:t xml:space="preserve"> </w:t>
+      </w:r>
+      <w:r>
+        <w:rPr>
+          <w:rFonts w:ascii="Nirmala UI" w:hAnsi="Nirmala UI" w:cs="Nirmala UI"/>
+        </w:rPr>
+        <w:t>করবে</w:t>
+      </w:r>
+    </w:p>
+    <w:p>
+      <w:r>
+        <w:t>}));</w:t>
+      </w:r>
+    </w:p>
+    <w:p>
+      <w:pPr>
+        <w:rPr>
+          <w:b/>
+          <w:bCs/>
+        </w:rPr>
+      </w:pPr>
+      <w:r>
+        <w:rPr>
+          <w:rFonts w:ascii="Nirmala UI" w:hAnsi="Nirmala UI" w:cs="Nirmala UI"/>
+          <w:b/>
+          <w:bCs/>
+        </w:rPr>
+        <w:t>ধাপ</w:t>
+      </w:r>
+      <w:r>
+        <w:rPr>
+          <w:b/>
+          <w:bCs/>
+        </w:rPr>
+        <w:t xml:space="preserve"> </w:t>
+      </w:r>
+      <w:r>
+        <w:rPr>
+          <w:rFonts w:ascii="Nirmala UI" w:hAnsi="Nirmala UI" w:cs="Nirmala UI"/>
+          <w:b/>
+          <w:bCs/>
+        </w:rPr>
+        <w:t>৩</w:t>
+      </w:r>
+      <w:r>
+        <w:rPr>
+          <w:b/>
+          <w:bCs/>
+        </w:rPr>
+        <w:t xml:space="preserve">: </w:t>
+      </w:r>
+      <w:r>
+        <w:rPr>
+          <w:rFonts w:ascii="Nirmala UI" w:hAnsi="Nirmala UI" w:cs="Nirmala UI"/>
+          <w:b/>
+          <w:bCs/>
+        </w:rPr>
+        <w:t>কন্ট্রোলারে</w:t>
+      </w:r>
+      <w:r>
+        <w:rPr>
+          <w:b/>
+          <w:bCs/>
+        </w:rPr>
+        <w:t xml:space="preserve"> </w:t>
+      </w:r>
+      <w:r>
+        <w:rPr>
+          <w:rFonts w:ascii="Nirmala UI" w:hAnsi="Nirmala UI" w:cs="Nirmala UI"/>
+          <w:b/>
+          <w:bCs/>
+        </w:rPr>
+        <w:t>ব্যবহার</w:t>
+      </w:r>
+      <w:r>
+        <w:rPr>
+          <w:b/>
+          <w:bCs/>
+        </w:rPr>
+        <w:t xml:space="preserve"> </w:t>
+      </w:r>
+      <w:r>
+        <w:rPr>
+          <w:rFonts w:ascii="Nirmala UI" w:hAnsi="Nirmala UI" w:cs="Nirmala UI"/>
+          <w:b/>
+          <w:bCs/>
+        </w:rPr>
+        <w:t>করা</w:t>
+      </w:r>
+    </w:p>
+    <w:p>
+      <w:r>
+        <w:t>TypeScript</w:t>
+      </w:r>
+    </w:p>
+    <w:p>
+      <w:r>
+        <w:t>@Post('signup')</w:t>
+      </w:r>
+    </w:p>
+    <w:p>
+      <w:r>
+        <w:t>create(@Body() createUserDto: CreateUserDto) {</w:t>
+      </w:r>
+    </w:p>
+    <w:p>
+      <w:r>
+        <w:t xml:space="preserve">  // </w:t>
+      </w:r>
+      <w:r>
+        <w:rPr>
+          <w:rFonts w:ascii="Nirmala UI" w:hAnsi="Nirmala UI" w:cs="Nirmala UI"/>
+        </w:rPr>
+        <w:t>এখানে</w:t>
+      </w:r>
+      <w:r>
+        <w:t xml:space="preserve"> </w:t>
+      </w:r>
+      <w:r>
+        <w:rPr>
+          <w:rFonts w:ascii="Nirmala UI" w:hAnsi="Nirmala UI" w:cs="Nirmala UI"/>
+        </w:rPr>
+        <w:t>ডাটা</w:t>
+      </w:r>
+      <w:r>
+        <w:t xml:space="preserve"> </w:t>
+      </w:r>
+      <w:r>
+        <w:rPr>
+          <w:rFonts w:ascii="Nirmala UI" w:hAnsi="Nirmala UI" w:cs="Nirmala UI"/>
+        </w:rPr>
+        <w:t>আসার</w:t>
+      </w:r>
+      <w:r>
+        <w:t xml:space="preserve"> </w:t>
+      </w:r>
+      <w:r>
+        <w:rPr>
+          <w:rFonts w:ascii="Nirmala UI" w:hAnsi="Nirmala UI" w:cs="Nirmala UI"/>
+        </w:rPr>
+        <w:t>আগেই</w:t>
+      </w:r>
+      <w:r>
+        <w:t xml:space="preserve"> class-validator </w:t>
+      </w:r>
+      <w:r>
+        <w:rPr>
+          <w:rFonts w:ascii="Nirmala UI" w:hAnsi="Nirmala UI" w:cs="Nirmala UI"/>
+        </w:rPr>
+        <w:t>চেক</w:t>
+      </w:r>
+      <w:r>
+        <w:t xml:space="preserve"> </w:t>
+      </w:r>
+      <w:r>
+        <w:rPr>
+          <w:rFonts w:ascii="Nirmala UI" w:hAnsi="Nirmala UI" w:cs="Nirmala UI"/>
+        </w:rPr>
+        <w:t>করে</w:t>
+      </w:r>
+      <w:r>
+        <w:t xml:space="preserve"> </w:t>
+      </w:r>
+      <w:r>
+        <w:rPr>
+          <w:rFonts w:ascii="Nirmala UI" w:hAnsi="Nirmala UI" w:cs="Nirmala UI"/>
+        </w:rPr>
+        <w:t>ফেলবে</w:t>
+      </w:r>
+      <w:r>
+        <w:t xml:space="preserve"> </w:t>
+      </w:r>
+      <w:r>
+        <w:rPr>
+          <w:rFonts w:ascii="Nirmala UI" w:hAnsi="Nirmala UI" w:cs="Nirmala UI"/>
+        </w:rPr>
+        <w:t>সব</w:t>
+      </w:r>
+      <w:r>
+        <w:t xml:space="preserve"> </w:t>
+      </w:r>
+      <w:r>
+        <w:rPr>
+          <w:rFonts w:ascii="Nirmala UI" w:hAnsi="Nirmala UI" w:cs="Nirmala UI"/>
+        </w:rPr>
+        <w:t>ঠিক</w:t>
+      </w:r>
+      <w:r>
+        <w:t xml:space="preserve"> </w:t>
+      </w:r>
+      <w:r>
+        <w:rPr>
+          <w:rFonts w:ascii="Nirmala UI" w:hAnsi="Nirmala UI" w:cs="Nirmala UI"/>
+        </w:rPr>
+        <w:t>আছে</w:t>
+      </w:r>
+      <w:r>
+        <w:t xml:space="preserve"> </w:t>
+      </w:r>
+      <w:r>
+        <w:rPr>
+          <w:rFonts w:ascii="Nirmala UI" w:hAnsi="Nirmala UI" w:cs="Nirmala UI"/>
+        </w:rPr>
+        <w:t>কি</w:t>
+      </w:r>
+      <w:r>
+        <w:t xml:space="preserve"> </w:t>
+      </w:r>
+      <w:r>
+        <w:rPr>
+          <w:rFonts w:ascii="Nirmala UI" w:hAnsi="Nirmala UI" w:cs="Nirmala UI"/>
+        </w:rPr>
+        <w:t>না</w:t>
+      </w:r>
+    </w:p>
+    <w:p>
+      <w:r>
+        <w:t xml:space="preserve">  return '</w:t>
+      </w:r>
+      <w:r>
+        <w:rPr>
+          <w:rFonts w:ascii="Nirmala UI" w:hAnsi="Nirmala UI" w:cs="Nirmala UI"/>
+        </w:rPr>
+        <w:t>ইউজার</w:t>
+      </w:r>
+      <w:r>
+        <w:t xml:space="preserve"> </w:t>
+      </w:r>
+      <w:r>
+        <w:rPr>
+          <w:rFonts w:ascii="Nirmala UI" w:hAnsi="Nirmala UI" w:cs="Nirmala UI"/>
+        </w:rPr>
+        <w:t>তৈরি</w:t>
+      </w:r>
+      <w:r>
+        <w:t xml:space="preserve"> </w:t>
+      </w:r>
+      <w:r>
+        <w:rPr>
+          <w:rFonts w:ascii="Nirmala UI" w:hAnsi="Nirmala UI" w:cs="Nirmala UI"/>
+        </w:rPr>
+        <w:t>করা</w:t>
+      </w:r>
+      <w:r>
+        <w:t xml:space="preserve"> </w:t>
+      </w:r>
+      <w:r>
+        <w:rPr>
+          <w:rFonts w:ascii="Nirmala UI" w:hAnsi="Nirmala UI" w:cs="Nirmala UI"/>
+        </w:rPr>
+        <w:t>সম্ভব</w:t>
+      </w:r>
+      <w:r>
+        <w:t>!';</w:t>
+      </w:r>
+    </w:p>
+    <w:p>
+      <w:r>
+        <w:t>}</w:t>
+      </w:r>
+    </w:p>
+    <w:p>
+      <w:r>
+        <w:pict w14:anchorId="0E8D71DB">
+          <v:rect id="_x0000_i1064" style="width:0;height:1.5pt" o:hralign="center" o:hrstd="t" o:hrnoshade="t" o:hr="t" fillcolor="gray" stroked="f"/>
+        </w:pict>
+      </w:r>
+    </w:p>
+    <w:p>
+      <w:pPr>
+        <w:rPr>
+          <w:b/>
+          <w:bCs/>
+        </w:rPr>
+      </w:pPr>
+      <w:r>
+        <w:rPr>
+          <w:rFonts w:ascii="Nirmala UI" w:hAnsi="Nirmala UI" w:cs="Nirmala UI"/>
+          <w:b/>
+          <w:bCs/>
+        </w:rPr>
+        <w:t>সারসংক্ষেপ</w:t>
+      </w:r>
+      <w:r>
+        <w:rPr>
+          <w:b/>
+          <w:bCs/>
+        </w:rPr>
+        <w:t xml:space="preserve"> (Short Summary)</w:t>
+      </w:r>
+    </w:p>
+    <w:tbl>
+      <w:tblPr>
+        <w:tblW w:w="0" w:type="auto"/>
+        <w:tblCellSpacing w:w="15" w:type="dxa"/>
+        <w:tblCellMar>
+          <w:left w:w="0" w:type="dxa"/>
+          <w:right w:w="0" w:type="dxa"/>
+        </w:tblCellMar>
+        <w:tblLook w:val="04A0" w:firstRow="1" w:lastRow="0" w:firstColumn="1" w:lastColumn="0" w:noHBand="0" w:noVBand="1"/>
+      </w:tblPr>
+      <w:tblGrid>
+        <w:gridCol w:w="2217"/>
+        <w:gridCol w:w="6137"/>
+      </w:tblGrid>
+      <w:tr>
+        <w:trPr>
+          <w:tblHeader/>
+          <w:tblCellSpacing w:w="15" w:type="dxa"/>
+        </w:trPr>
+        <w:tc>
+          <w:tcPr>
+            <w:tcW w:w="0" w:type="auto"/>
+            <w:tcBorders>
+              <w:top w:val="single" w:sz="6" w:space="0" w:color="auto"/>
+              <w:left w:val="single" w:sz="6" w:space="0" w:color="auto"/>
+              <w:bottom w:val="single" w:sz="6" w:space="0" w:color="auto"/>
+              <w:right w:val="single" w:sz="6" w:space="0" w:color="auto"/>
+            </w:tcBorders>
+            <w:tcMar>
+              <w:top w:w="240" w:type="dxa"/>
+              <w:left w:w="0" w:type="dxa"/>
+              <w:bottom w:w="240" w:type="dxa"/>
+              <w:right w:w="180" w:type="dxa"/>
+            </w:tcMar>
+            <w:vAlign w:val="center"/>
+            <w:hideMark/>
+          </w:tcPr>
+          <w:p>
+            <w:r>
+              <w:rPr>
+                <w:rFonts w:ascii="Nirmala UI" w:hAnsi="Nirmala UI" w:cs="Nirmala UI"/>
+                <w:b/>
+                <w:bCs/>
+              </w:rPr>
+              <w:t>টুল</w:t>
+            </w:r>
+          </w:p>
+        </w:tc>
+        <w:tc>
+          <w:tcPr>
+            <w:tcW w:w="0" w:type="auto"/>
+            <w:tcBorders>
+              <w:top w:val="single" w:sz="6" w:space="0" w:color="auto"/>
+              <w:left w:val="single" w:sz="6" w:space="0" w:color="auto"/>
+              <w:bottom w:val="single" w:sz="6" w:space="0" w:color="auto"/>
+              <w:right w:val="single" w:sz="6" w:space="0" w:color="auto"/>
+            </w:tcBorders>
+            <w:tcMar>
+              <w:top w:w="240" w:type="dxa"/>
+              <w:left w:w="0" w:type="dxa"/>
+              <w:bottom w:w="240" w:type="dxa"/>
+              <w:right w:w="0" w:type="dxa"/>
+            </w:tcMar>
+            <w:vAlign w:val="center"/>
+            <w:hideMark/>
+          </w:tcPr>
+          <w:p>
+            <w:r>
+              <w:rPr>
+                <w:rFonts w:ascii="Nirmala UI" w:hAnsi="Nirmala UI" w:cs="Nirmala UI"/>
+                <w:b/>
+                <w:bCs/>
+              </w:rPr>
+              <w:t>সহজ</w:t>
+            </w:r>
+            <w:r>
+              <w:rPr>
+                <w:b/>
+                <w:bCs/>
+              </w:rPr>
+              <w:t xml:space="preserve"> </w:t>
+            </w:r>
+            <w:r>
+              <w:rPr>
+                <w:rFonts w:ascii="Nirmala UI" w:hAnsi="Nirmala UI" w:cs="Nirmala UI"/>
+                <w:b/>
+                <w:bCs/>
+              </w:rPr>
+              <w:t>বাংলা</w:t>
+            </w:r>
+            <w:r>
+              <w:rPr>
+                <w:b/>
+                <w:bCs/>
+              </w:rPr>
+              <w:t xml:space="preserve"> </w:t>
+            </w:r>
+            <w:r>
+              <w:rPr>
+                <w:rFonts w:ascii="Nirmala UI" w:hAnsi="Nirmala UI" w:cs="Nirmala UI"/>
+                <w:b/>
+                <w:bCs/>
+              </w:rPr>
+              <w:t>কাজ</w:t>
+            </w:r>
+          </w:p>
+        </w:tc>
+      </w:tr>
+      <w:tr>
+        <w:trPr>
+          <w:tblCellSpacing w:w="15" w:type="dxa"/>
+        </w:trPr>
+        <w:tc>
+          <w:tcPr>
+            <w:tcW w:w="0" w:type="auto"/>
+            <w:tcBorders>
+              <w:top w:val="single" w:sz="6" w:space="0" w:color="auto"/>
+              <w:left w:val="single" w:sz="6" w:space="0" w:color="auto"/>
+              <w:bottom w:val="single" w:sz="6" w:space="0" w:color="auto"/>
+              <w:right w:val="single" w:sz="6" w:space="0" w:color="auto"/>
+            </w:tcBorders>
+            <w:tcMar>
+              <w:top w:w="240" w:type="dxa"/>
+              <w:left w:w="0" w:type="dxa"/>
+              <w:bottom w:w="240" w:type="dxa"/>
+              <w:right w:w="180" w:type="dxa"/>
+            </w:tcMar>
+            <w:vAlign w:val="center"/>
+            <w:hideMark/>
+          </w:tcPr>
+          <w:p>
+            <w:r>
+              <w:rPr>
+                <w:b/>
+                <w:bCs/>
+              </w:rPr>
+              <w:t>DTO</w:t>
+            </w:r>
+          </w:p>
+        </w:tc>
+        <w:tc>
+          <w:tcPr>
+            <w:tcW w:w="0" w:type="auto"/>
+            <w:tcBorders>
+              <w:top w:val="single" w:sz="6" w:space="0" w:color="auto"/>
+              <w:left w:val="single" w:sz="6" w:space="0" w:color="auto"/>
+              <w:bottom w:val="single" w:sz="6" w:space="0" w:color="auto"/>
+              <w:right w:val="single" w:sz="6" w:space="0" w:color="auto"/>
+            </w:tcBorders>
+            <w:tcMar>
+              <w:top w:w="240" w:type="dxa"/>
+              <w:left w:w="0" w:type="dxa"/>
+              <w:bottom w:w="240" w:type="dxa"/>
+              <w:right w:w="0" w:type="dxa"/>
+            </w:tcMar>
+            <w:vAlign w:val="center"/>
+            <w:hideMark/>
+          </w:tcPr>
+          <w:p>
+            <w:r>
+              <w:rPr>
+                <w:rFonts w:ascii="Nirmala UI" w:hAnsi="Nirmala UI" w:cs="Nirmala UI"/>
+              </w:rPr>
+              <w:t>ডাটা</w:t>
+            </w:r>
+            <w:r>
+              <w:t xml:space="preserve"> </w:t>
+            </w:r>
+            <w:r>
+              <w:rPr>
+                <w:rFonts w:ascii="Nirmala UI" w:hAnsi="Nirmala UI" w:cs="Nirmala UI"/>
+              </w:rPr>
+              <w:t>কেমন</w:t>
+            </w:r>
+            <w:r>
+              <w:t xml:space="preserve"> </w:t>
+            </w:r>
+            <w:r>
+              <w:rPr>
+                <w:rFonts w:ascii="Nirmala UI" w:hAnsi="Nirmala UI" w:cs="Nirmala UI"/>
+              </w:rPr>
+              <w:t>হবে</w:t>
+            </w:r>
+            <w:r>
+              <w:t xml:space="preserve"> </w:t>
+            </w:r>
+            <w:r>
+              <w:rPr>
+                <w:rFonts w:ascii="Nirmala UI" w:hAnsi="Nirmala UI" w:cs="Nirmala UI"/>
+              </w:rPr>
+              <w:t>তার</w:t>
+            </w:r>
+            <w:r>
+              <w:t xml:space="preserve"> </w:t>
+            </w:r>
+            <w:r>
+              <w:rPr>
+                <w:rFonts w:ascii="Nirmala UI" w:hAnsi="Nirmala UI" w:cs="Nirmala UI"/>
+                <w:b/>
+                <w:bCs/>
+              </w:rPr>
+              <w:t>লিস্ট</w:t>
+            </w:r>
+            <w:r>
+              <w:rPr>
+                <w:b/>
+                <w:bCs/>
+              </w:rPr>
+              <w:t xml:space="preserve"> </w:t>
+            </w:r>
+            <w:r>
+              <w:rPr>
+                <w:rFonts w:ascii="Nirmala UI" w:hAnsi="Nirmala UI" w:cs="Nirmala UI"/>
+                <w:b/>
+                <w:bCs/>
+              </w:rPr>
+              <w:t>বা</w:t>
+            </w:r>
+            <w:r>
+              <w:rPr>
+                <w:b/>
+                <w:bCs/>
+              </w:rPr>
+              <w:t xml:space="preserve"> </w:t>
+            </w:r>
+            <w:r>
+              <w:rPr>
+                <w:rFonts w:ascii="Nirmala UI" w:hAnsi="Nirmala UI" w:cs="Nirmala UI"/>
+                <w:b/>
+                <w:bCs/>
+              </w:rPr>
+              <w:t>ম্যাপ</w:t>
+            </w:r>
+            <w:r>
+              <w:t xml:space="preserve"> </w:t>
+            </w:r>
+            <w:r>
+              <w:rPr>
+                <w:rFonts w:ascii="Nirmala UI" w:hAnsi="Nirmala UI" w:cs="Nirmala UI"/>
+              </w:rPr>
+              <w:t>তৈরি</w:t>
+            </w:r>
+            <w:r>
+              <w:t xml:space="preserve"> </w:t>
+            </w:r>
+            <w:r>
+              <w:rPr>
+                <w:rFonts w:ascii="Nirmala UI" w:hAnsi="Nirmala UI" w:cs="Nirmala UI"/>
+              </w:rPr>
+              <w:t>করা।</w:t>
+            </w:r>
+          </w:p>
+        </w:tc>
+      </w:tr>
+      <w:tr>
+        <w:trPr>
+          <w:tblCellSpacing w:w="15" w:type="dxa"/>
+        </w:trPr>
+        <w:tc>
+          <w:tcPr>
+            <w:tcW w:w="0" w:type="auto"/>
+            <w:tcBorders>
+              <w:top w:val="single" w:sz="6" w:space="0" w:color="auto"/>
+              <w:left w:val="single" w:sz="6" w:space="0" w:color="auto"/>
+              <w:bottom w:val="single" w:sz="6" w:space="0" w:color="auto"/>
+              <w:right w:val="single" w:sz="6" w:space="0" w:color="auto"/>
+            </w:tcBorders>
+            <w:tcMar>
+              <w:top w:w="240" w:type="dxa"/>
+              <w:left w:w="0" w:type="dxa"/>
+              <w:bottom w:w="240" w:type="dxa"/>
+              <w:right w:w="180" w:type="dxa"/>
+            </w:tcMar>
+            <w:vAlign w:val="center"/>
+            <w:hideMark/>
+          </w:tcPr>
+          <w:p>
+            <w:r>
+              <w:rPr>
+                <w:b/>
+                <w:bCs/>
+              </w:rPr>
+              <w:t>class-validator</w:t>
+            </w:r>
+          </w:p>
+        </w:tc>
+        <w:tc>
+          <w:tcPr>
+            <w:tcW w:w="0" w:type="auto"/>
+            <w:tcBorders>
+              <w:top w:val="single" w:sz="6" w:space="0" w:color="auto"/>
+              <w:left w:val="single" w:sz="6" w:space="0" w:color="auto"/>
+              <w:bottom w:val="single" w:sz="6" w:space="0" w:color="auto"/>
+              <w:right w:val="single" w:sz="6" w:space="0" w:color="auto"/>
+            </w:tcBorders>
+            <w:tcMar>
+              <w:top w:w="240" w:type="dxa"/>
+              <w:left w:w="0" w:type="dxa"/>
+              <w:bottom w:w="240" w:type="dxa"/>
+              <w:right w:w="0" w:type="dxa"/>
+            </w:tcMar>
+            <w:vAlign w:val="center"/>
+            <w:hideMark/>
+          </w:tcPr>
+          <w:p>
+            <w:r>
+              <w:rPr>
+                <w:rFonts w:ascii="Nirmala UI" w:hAnsi="Nirmala UI" w:cs="Nirmala UI"/>
+              </w:rPr>
+              <w:t>ডাটা</w:t>
+            </w:r>
+            <w:r>
+              <w:t xml:space="preserve"> </w:t>
+            </w:r>
+            <w:r>
+              <w:rPr>
+                <w:rFonts w:ascii="Nirmala UI" w:hAnsi="Nirmala UI" w:cs="Nirmala UI"/>
+                <w:b/>
+                <w:bCs/>
+              </w:rPr>
+              <w:t>সঠিক</w:t>
+            </w:r>
+            <w:r>
+              <w:t xml:space="preserve"> </w:t>
+            </w:r>
+            <w:r>
+              <w:rPr>
+                <w:rFonts w:ascii="Nirmala UI" w:hAnsi="Nirmala UI" w:cs="Nirmala UI"/>
+              </w:rPr>
+              <w:t>কি</w:t>
+            </w:r>
+            <w:r>
+              <w:t xml:space="preserve"> </w:t>
+            </w:r>
+            <w:r>
+              <w:rPr>
+                <w:rFonts w:ascii="Nirmala UI" w:hAnsi="Nirmala UI" w:cs="Nirmala UI"/>
+              </w:rPr>
+              <w:t>না</w:t>
+            </w:r>
+            <w:r>
+              <w:t xml:space="preserve"> (</w:t>
+            </w:r>
+            <w:r>
+              <w:rPr>
+                <w:rFonts w:ascii="Nirmala UI" w:hAnsi="Nirmala UI" w:cs="Nirmala UI"/>
+              </w:rPr>
+              <w:t>ইমেইল</w:t>
+            </w:r>
+            <w:r>
+              <w:t xml:space="preserve"> </w:t>
+            </w:r>
+            <w:r>
+              <w:rPr>
+                <w:rFonts w:ascii="Nirmala UI" w:hAnsi="Nirmala UI" w:cs="Nirmala UI"/>
+              </w:rPr>
+              <w:t>কি</w:t>
+            </w:r>
+            <w:r>
+              <w:t xml:space="preserve"> </w:t>
+            </w:r>
+            <w:r>
+              <w:rPr>
+                <w:rFonts w:ascii="Nirmala UI" w:hAnsi="Nirmala UI" w:cs="Nirmala UI"/>
+              </w:rPr>
+              <w:t>না</w:t>
+            </w:r>
+            <w:r>
+              <w:t xml:space="preserve">, </w:t>
+            </w:r>
+            <w:r>
+              <w:rPr>
+                <w:rFonts w:ascii="Nirmala UI" w:hAnsi="Nirmala UI" w:cs="Nirmala UI"/>
+              </w:rPr>
+              <w:t>ছোট</w:t>
+            </w:r>
+            <w:r>
+              <w:t xml:space="preserve"> </w:t>
+            </w:r>
+            <w:r>
+              <w:rPr>
+                <w:rFonts w:ascii="Nirmala UI" w:hAnsi="Nirmala UI" w:cs="Nirmala UI"/>
+              </w:rPr>
+              <w:t>কি</w:t>
+            </w:r>
+            <w:r>
+              <w:t xml:space="preserve"> </w:t>
+            </w:r>
+            <w:r>
+              <w:rPr>
+                <w:rFonts w:ascii="Nirmala UI" w:hAnsi="Nirmala UI" w:cs="Nirmala UI"/>
+              </w:rPr>
+              <w:t>না</w:t>
+            </w:r>
+            <w:r>
+              <w:t xml:space="preserve">) </w:t>
+            </w:r>
+            <w:r>
+              <w:rPr>
+                <w:rFonts w:ascii="Nirmala UI" w:hAnsi="Nirmala UI" w:cs="Nirmala UI"/>
+              </w:rPr>
+              <w:t>তা</w:t>
+            </w:r>
+            <w:r>
+              <w:t xml:space="preserve"> </w:t>
+            </w:r>
+            <w:r>
+              <w:rPr>
+                <w:rFonts w:ascii="Nirmala UI" w:hAnsi="Nirmala UI" w:cs="Nirmala UI"/>
+              </w:rPr>
+              <w:t>পরীক্ষা</w:t>
+            </w:r>
+            <w:r>
+              <w:t xml:space="preserve"> </w:t>
+            </w:r>
+            <w:r>
+              <w:rPr>
+                <w:rFonts w:ascii="Nirmala UI" w:hAnsi="Nirmala UI" w:cs="Nirmala UI"/>
+              </w:rPr>
+              <w:t>করা।</w:t>
+            </w:r>
+          </w:p>
+        </w:tc>
+      </w:tr>
+      <w:tr>
+        <w:trPr>
+          <w:tblCellSpacing w:w="15" w:type="dxa"/>
+        </w:trPr>
+        <w:tc>
+          <w:tcPr>
+            <w:tcW w:w="0" w:type="auto"/>
+            <w:tcBorders>
+              <w:top w:val="single" w:sz="6" w:space="0" w:color="auto"/>
+              <w:left w:val="single" w:sz="6" w:space="0" w:color="auto"/>
+              <w:bottom w:val="single" w:sz="6" w:space="0" w:color="auto"/>
+              <w:right w:val="single" w:sz="6" w:space="0" w:color="auto"/>
+            </w:tcBorders>
+            <w:tcMar>
+              <w:top w:w="240" w:type="dxa"/>
+              <w:left w:w="0" w:type="dxa"/>
+              <w:bottom w:w="240" w:type="dxa"/>
+              <w:right w:w="180" w:type="dxa"/>
+            </w:tcMar>
+            <w:vAlign w:val="center"/>
+            <w:hideMark/>
+          </w:tcPr>
+          <w:p>
+            <w:r>
+              <w:rPr>
+                <w:b/>
+                <w:bCs/>
+              </w:rPr>
+              <w:t>class-transformer</w:t>
+            </w:r>
+          </w:p>
+        </w:tc>
+        <w:tc>
+          <w:tcPr>
+            <w:tcW w:w="0" w:type="auto"/>
+            <w:tcBorders>
+              <w:top w:val="single" w:sz="6" w:space="0" w:color="auto"/>
+              <w:left w:val="single" w:sz="6" w:space="0" w:color="auto"/>
+              <w:bottom w:val="single" w:sz="6" w:space="0" w:color="auto"/>
+              <w:right w:val="single" w:sz="6" w:space="0" w:color="auto"/>
+            </w:tcBorders>
+            <w:tcMar>
+              <w:top w:w="240" w:type="dxa"/>
+              <w:left w:w="0" w:type="dxa"/>
+              <w:bottom w:w="240" w:type="dxa"/>
+              <w:right w:w="0" w:type="dxa"/>
+            </w:tcMar>
+            <w:vAlign w:val="center"/>
+            <w:hideMark/>
+          </w:tcPr>
+          <w:p>
+            <w:r>
+              <w:rPr>
+                <w:rFonts w:ascii="Nirmala UI" w:hAnsi="Nirmala UI" w:cs="Nirmala UI"/>
+              </w:rPr>
+              <w:t>ডাটাকে</w:t>
+            </w:r>
+            <w:r>
+              <w:t xml:space="preserve"> </w:t>
+            </w:r>
+            <w:r>
+              <w:rPr>
+                <w:rFonts w:ascii="Nirmala UI" w:hAnsi="Nirmala UI" w:cs="Nirmala UI"/>
+              </w:rPr>
+              <w:t>ক্লাসের</w:t>
+            </w:r>
+            <w:r>
+              <w:t xml:space="preserve"> </w:t>
+            </w:r>
+            <w:r>
+              <w:rPr>
+                <w:rFonts w:ascii="Nirmala UI" w:hAnsi="Nirmala UI" w:cs="Nirmala UI"/>
+              </w:rPr>
+              <w:t>ফরমেটে</w:t>
+            </w:r>
+            <w:r>
+              <w:t xml:space="preserve"> </w:t>
+            </w:r>
+            <w:r>
+              <w:rPr>
+                <w:rFonts w:ascii="Nirmala UI" w:hAnsi="Nirmala UI" w:cs="Nirmala UI"/>
+                <w:b/>
+                <w:bCs/>
+              </w:rPr>
+              <w:t>রূপান্তর</w:t>
+            </w:r>
+            <w:r>
+              <w:t xml:space="preserve"> </w:t>
+            </w:r>
+            <w:r>
+              <w:rPr>
+                <w:rFonts w:ascii="Nirmala UI" w:hAnsi="Nirmala UI" w:cs="Nirmala UI"/>
+              </w:rPr>
+              <w:t>করা</w:t>
+            </w:r>
+            <w:r>
+              <w:t xml:space="preserve"> </w:t>
+            </w:r>
+            <w:r>
+              <w:rPr>
+                <w:rFonts w:ascii="Nirmala UI" w:hAnsi="Nirmala UI" w:cs="Nirmala UI"/>
+              </w:rPr>
+              <w:t>বা</w:t>
+            </w:r>
+            <w:r>
+              <w:t xml:space="preserve"> </w:t>
+            </w:r>
+            <w:r>
+              <w:rPr>
+                <w:rFonts w:ascii="Nirmala UI" w:hAnsi="Nirmala UI" w:cs="Nirmala UI"/>
+              </w:rPr>
+              <w:t>অটো</w:t>
+            </w:r>
+            <w:r>
+              <w:t>-</w:t>
+            </w:r>
+            <w:r>
+              <w:rPr>
+                <w:rFonts w:ascii="Nirmala UI" w:hAnsi="Nirmala UI" w:cs="Nirmala UI"/>
+              </w:rPr>
+              <w:t>কাস্টিং</w:t>
+            </w:r>
+            <w:r>
+              <w:t xml:space="preserve"> </w:t>
+            </w:r>
+            <w:r>
+              <w:rPr>
+                <w:rFonts w:ascii="Nirmala UI" w:hAnsi="Nirmala UI" w:cs="Nirmala UI"/>
+              </w:rPr>
+              <w:t>করা।</w:t>
+            </w:r>
+          </w:p>
+        </w:tc>
+      </w:tr>
+    </w:tbl>
+    <w:p>
+      <w:r>
+        <w:rPr>
+          <w:rFonts w:ascii="Nirmala UI" w:hAnsi="Nirmala UI" w:cs="Nirmala UI"/>
+        </w:rPr>
+        <w:t>এগুলো</w:t>
+      </w:r>
+      <w:r>
+        <w:t xml:space="preserve"> </w:t>
+      </w:r>
+      <w:r>
+        <w:rPr>
+          <w:rFonts w:ascii="Nirmala UI" w:hAnsi="Nirmala UI" w:cs="Nirmala UI"/>
+        </w:rPr>
+        <w:t>ব্যবহার</w:t>
+      </w:r>
+      <w:r>
+        <w:t xml:space="preserve"> </w:t>
+      </w:r>
+      <w:r>
+        <w:rPr>
+          <w:rFonts w:ascii="Nirmala UI" w:hAnsi="Nirmala UI" w:cs="Nirmala UI"/>
+        </w:rPr>
+        <w:t>করলে</w:t>
+      </w:r>
+      <w:r>
+        <w:t xml:space="preserve"> </w:t>
+      </w:r>
+      <w:r>
+        <w:rPr>
+          <w:rFonts w:ascii="Nirmala UI" w:hAnsi="Nirmala UI" w:cs="Nirmala UI"/>
+        </w:rPr>
+        <w:t>আপনার</w:t>
+      </w:r>
+      <w:r>
+        <w:t xml:space="preserve"> </w:t>
+      </w:r>
+      <w:r>
+        <w:rPr>
+          <w:rFonts w:ascii="Nirmala UI" w:hAnsi="Nirmala UI" w:cs="Nirmala UI"/>
+        </w:rPr>
+        <w:t>অ্যাপ</w:t>
+      </w:r>
+      <w:r>
+        <w:t xml:space="preserve"> </w:t>
+      </w:r>
+      <w:r>
+        <w:rPr>
+          <w:rFonts w:ascii="Nirmala UI" w:hAnsi="Nirmala UI" w:cs="Nirmala UI"/>
+        </w:rPr>
+        <w:t>অনেক</w:t>
+      </w:r>
+      <w:r>
+        <w:t xml:space="preserve"> </w:t>
+      </w:r>
+      <w:r>
+        <w:rPr>
+          <w:rFonts w:ascii="Nirmala UI" w:hAnsi="Nirmala UI" w:cs="Nirmala UI"/>
+        </w:rPr>
+        <w:t>বেশি</w:t>
+      </w:r>
+      <w:r>
+        <w:t xml:space="preserve"> </w:t>
+      </w:r>
+      <w:r>
+        <w:rPr>
+          <w:rFonts w:ascii="Nirmala UI" w:hAnsi="Nirmala UI" w:cs="Nirmala UI"/>
+        </w:rPr>
+        <w:t>সিকিউর</w:t>
+      </w:r>
+      <w:r>
+        <w:t xml:space="preserve"> </w:t>
+      </w:r>
+      <w:r>
+        <w:rPr>
+          <w:rFonts w:ascii="Nirmala UI" w:hAnsi="Nirmala UI" w:cs="Nirmala UI"/>
+        </w:rPr>
+        <w:t>হয়</w:t>
+      </w:r>
+      <w:r>
+        <w:t xml:space="preserve"> </w:t>
+      </w:r>
+      <w:r>
+        <w:rPr>
+          <w:rFonts w:ascii="Nirmala UI" w:hAnsi="Nirmala UI" w:cs="Nirmala UI"/>
+        </w:rPr>
+        <w:t>এবং</w:t>
+      </w:r>
+      <w:r>
+        <w:t xml:space="preserve"> </w:t>
+      </w:r>
+      <w:r>
+        <w:rPr>
+          <w:rFonts w:ascii="Nirmala UI" w:hAnsi="Nirmala UI" w:cs="Nirmala UI"/>
+        </w:rPr>
+        <w:t>ভুল</w:t>
+      </w:r>
+      <w:r>
+        <w:t xml:space="preserve"> </w:t>
+      </w:r>
+      <w:r>
+        <w:rPr>
+          <w:rFonts w:ascii="Nirmala UI" w:hAnsi="Nirmala UI" w:cs="Nirmala UI"/>
+        </w:rPr>
+        <w:t>ডাটা</w:t>
+      </w:r>
+      <w:r>
+        <w:t xml:space="preserve"> </w:t>
+      </w:r>
+      <w:r>
+        <w:rPr>
+          <w:rFonts w:ascii="Nirmala UI" w:hAnsi="Nirmala UI" w:cs="Nirmala UI"/>
+        </w:rPr>
+        <w:t>ইনপুট</w:t>
+      </w:r>
+      <w:r>
+        <w:t xml:space="preserve"> </w:t>
+      </w:r>
+      <w:r>
+        <w:rPr>
+          <w:rFonts w:ascii="Nirmala UI" w:hAnsi="Nirmala UI" w:cs="Nirmala UI"/>
+        </w:rPr>
+        <w:t>হওয়ার</w:t>
+      </w:r>
+      <w:r>
+        <w:t xml:space="preserve"> </w:t>
+      </w:r>
+      <w:r>
+        <w:rPr>
+          <w:rFonts w:ascii="Nirmala UI" w:hAnsi="Nirmala UI" w:cs="Nirmala UI"/>
+        </w:rPr>
+        <w:t>সুযোগ</w:t>
+      </w:r>
+      <w:r>
+        <w:t xml:space="preserve"> </w:t>
+      </w:r>
+      <w:r>
+        <w:rPr>
+          <w:rFonts w:ascii="Nirmala UI" w:hAnsi="Nirmala UI" w:cs="Nirmala UI"/>
+        </w:rPr>
+        <w:t>থাকে</w:t>
+      </w:r>
+      <w:r>
+        <w:t xml:space="preserve"> </w:t>
+      </w:r>
+      <w:r>
+        <w:rPr>
+          <w:rFonts w:ascii="Nirmala UI" w:hAnsi="Nirmala UI" w:cs="Nirmala UI"/>
+        </w:rPr>
+        <w:t>না।</w:t>
+      </w:r>
+      <w:r>
+        <w:t xml:space="preserve"> </w:t>
+      </w:r>
+      <w:r>
+        <w:rPr>
+          <w:rFonts w:ascii="Nirmala UI" w:hAnsi="Nirmala UI" w:cs="Nirmala UI"/>
+        </w:rPr>
+        <w:t>বুঝতে</w:t>
+      </w:r>
+      <w:r>
+        <w:t xml:space="preserve"> </w:t>
+      </w:r>
+      <w:r>
+        <w:rPr>
+          <w:rFonts w:ascii="Nirmala UI" w:hAnsi="Nirmala UI" w:cs="Nirmala UI"/>
+        </w:rPr>
+        <w:t>কি</w:t>
+      </w:r>
+      <w:r>
+        <w:t xml:space="preserve"> </w:t>
+      </w:r>
+      <w:r>
+        <w:rPr>
+          <w:rFonts w:ascii="Nirmala UI" w:hAnsi="Nirmala UI" w:cs="Nirmala UI"/>
+        </w:rPr>
+        <w:t>কোথাও</w:t>
+      </w:r>
+      <w:r>
+        <w:t xml:space="preserve"> </w:t>
+      </w:r>
+      <w:r>
+        <w:rPr>
+          <w:rFonts w:ascii="Nirmala UI" w:hAnsi="Nirmala UI" w:cs="Nirmala UI"/>
+        </w:rPr>
+        <w:t>সমস্যা</w:t>
+      </w:r>
+      <w:r>
+        <w:t xml:space="preserve"> </w:t>
+      </w:r>
+      <w:r>
+        <w:rPr>
+          <w:rFonts w:ascii="Nirmala UI" w:hAnsi="Nirmala UI" w:cs="Nirmala UI"/>
+        </w:rPr>
+        <w:t>হচ্ছে</w:t>
+      </w:r>
+      <w:r>
+        <w:t>?</w:t>
+      </w:r>
+    </w:p>
     <w:p/>
     <w:sectPr>
       <w:pgSz w:w="12240" w:h="15840"/>
@@ -6045,6 +9993,453 @@
 <file path=word/numbering.xml><?xml version="1.0" encoding="utf-8"?>
 <w:numbering xmlns:wpc="http://schemas.microsoft.com/office/word/2010/wordprocessingCanvas" xmlns:cx="http://schemas.microsoft.com/office/drawing/2014/chartex" xmlns:cx1="http://schemas.microsoft.com/office/drawing/2015/9/8/chartex" xmlns:cx2="http://schemas.microsoft.com/office/drawing/2015/10/21/chartex" xmlns:cx3="http://schemas.microsoft.com/office/drawing/2016/5/9/chartex" xmlns:cx4="http://schemas.microsoft.com/office/drawing/2016/5/10/chartex" xmlns:cx5="http://schemas.microsoft.com/office/drawing/2016/5/11/chartex" xmlns:cx6="http://schemas.microsoft.com/office/drawing/2016/5/12/chartex" xmlns:cx7="http://schemas.microsoft.com/office/drawing/2016/5/13/chartex" xmlns:cx8="http://schemas.microsoft.com/office/drawing/2016/5/14/chartex" xmlns:mc="http://schemas.openxmlformats.org/markup-compatibility/2006" xmlns:aink="http://schemas.microsoft.com/office/drawing/2016/ink" xmlns:am3d="http://schemas.microsoft.com/office/drawing/2017/model3d" xmlns:o="urn:schemas-microsoft-com:office:office" xmlns:oel="http://schemas.microsoft.com/office/2019/extlst" xmlns:r="http://schemas.openxmlformats.org/officeDocument/2006/relationships" xmlns:m="http://schemas.openxmlformats.org/officeDocument/2006/math" xmlns:v="urn:schemas-microsoft-com:vml" xmlns:wp14="http://schemas.microsoft.com/office/word/2010/wordprocessingDrawing" xmlns:wp="http://schemas.openxmlformats.org/drawingml/2006/wordprocessingDrawing" xmlns:w10="urn:schemas-microsoft-com:office:word" xmlns:w="http://schemas.openxmlformats.org/wordprocessingml/2006/main" xmlns:w14="http://schemas.microsoft.com/office/word/2010/wordml" xmlns:w15="http://schemas.microsoft.com/office/word/2012/wordml" xmlns:w16cex="http://schemas.microsoft.com/office/word/2018/wordml/cex" xmlns:w16cid="http://schemas.microsoft.com/office/word/2016/wordml/cid" xmlns:w16="http://schemas.microsoft.com/office/word/2018/wordml" xmlns:w16du="http://schemas.microsoft.com/office/word/2023/wordml/word16du" xmlns:w16sdtdh="http://schemas.microsoft.com/office/word/2020/wordml/sdtdatahash" xmlns:w16sdtfl="http://schemas.microsoft.com/office/word/2024/wordml/sdtformatlock" xmlns:w16se="http://schemas.microsoft.com/office/word/2015/wordml/symex" xmlns:wpg="http://schemas.microsoft.com/office/word/2010/wordprocessingGroup" xmlns:wpi="http://schemas.microsoft.com/office/word/2010/wordprocessingInk" xmlns:wne="http://schemas.microsoft.com/office/word/2006/wordml" xmlns:wps="http://schemas.microsoft.com/office/word/2010/wordprocessingShape" mc:Ignorable="w14 w15 w16se w16cid w16 w16cex w16sdtdh w16sdtfl w16du wp14">
   <w:abstractNum w:abstractNumId="0" w15:restartNumberingAfterBreak="0">
+    <w:nsid w:val="1E320C51"/>
+    <w:multiLevelType w:val="multilevel"/>
+    <w:tmpl w:val="4E2C3BA8"/>
+    <w:lvl w:ilvl="0">
+      <w:start w:val="1"/>
+      <w:numFmt w:val="bullet"/>
+      <w:lvlText w:val=""/>
+      <w:lvlJc w:val="left"/>
+      <w:pPr>
+        <w:tabs>
+          <w:tab w:val="num" w:pos="720"/>
+        </w:tabs>
+        <w:ind w:left="720" w:hanging="360"/>
+      </w:pPr>
+      <w:rPr>
+        <w:rFonts w:ascii="Symbol" w:hAnsi="Symbol" w:hint="default"/>
+        <w:sz w:val="20"/>
+      </w:rPr>
+    </w:lvl>
+    <w:lvl w:ilvl="1" w:tentative="1">
+      <w:start w:val="1"/>
+      <w:numFmt w:val="bullet"/>
+      <w:lvlText w:val="o"/>
+      <w:lvlJc w:val="left"/>
+      <w:pPr>
+        <w:tabs>
+          <w:tab w:val="num" w:pos="1440"/>
+        </w:tabs>
+        <w:ind w:left="1440" w:hanging="360"/>
+      </w:pPr>
+      <w:rPr>
+        <w:rFonts w:ascii="Courier New" w:hAnsi="Courier New" w:hint="default"/>
+        <w:sz w:val="20"/>
+      </w:rPr>
+    </w:lvl>
+    <w:lvl w:ilvl="2" w:tentative="1">
+      <w:start w:val="1"/>
+      <w:numFmt w:val="bullet"/>
+      <w:lvlText w:val=""/>
+      <w:lvlJc w:val="left"/>
+      <w:pPr>
+        <w:tabs>
+          <w:tab w:val="num" w:pos="2160"/>
+        </w:tabs>
+        <w:ind w:left="2160" w:hanging="360"/>
+      </w:pPr>
+      <w:rPr>
+        <w:rFonts w:ascii="Wingdings" w:hAnsi="Wingdings" w:hint="default"/>
+        <w:sz w:val="20"/>
+      </w:rPr>
+    </w:lvl>
+    <w:lvl w:ilvl="3" w:tentative="1">
+      <w:start w:val="1"/>
+      <w:numFmt w:val="bullet"/>
+      <w:lvlText w:val=""/>
+      <w:lvlJc w:val="left"/>
+      <w:pPr>
+        <w:tabs>
+          <w:tab w:val="num" w:pos="2880"/>
+        </w:tabs>
+        <w:ind w:left="2880" w:hanging="360"/>
+      </w:pPr>
+      <w:rPr>
+        <w:rFonts w:ascii="Wingdings" w:hAnsi="Wingdings" w:hint="default"/>
+        <w:sz w:val="20"/>
+      </w:rPr>
+    </w:lvl>
+    <w:lvl w:ilvl="4" w:tentative="1">
+      <w:start w:val="1"/>
+      <w:numFmt w:val="bullet"/>
+      <w:lvlText w:val=""/>
+      <w:lvlJc w:val="left"/>
+      <w:pPr>
+        <w:tabs>
+          <w:tab w:val="num" w:pos="3600"/>
+        </w:tabs>
+        <w:ind w:left="3600" w:hanging="360"/>
+      </w:pPr>
+      <w:rPr>
+        <w:rFonts w:ascii="Wingdings" w:hAnsi="Wingdings" w:hint="default"/>
+        <w:sz w:val="20"/>
+      </w:rPr>
+    </w:lvl>
+    <w:lvl w:ilvl="5" w:tentative="1">
+      <w:start w:val="1"/>
+      <w:numFmt w:val="bullet"/>
+      <w:lvlText w:val=""/>
+      <w:lvlJc w:val="left"/>
+      <w:pPr>
+        <w:tabs>
+          <w:tab w:val="num" w:pos="4320"/>
+        </w:tabs>
+        <w:ind w:left="4320" w:hanging="360"/>
+      </w:pPr>
+      <w:rPr>
+        <w:rFonts w:ascii="Wingdings" w:hAnsi="Wingdings" w:hint="default"/>
+        <w:sz w:val="20"/>
+      </w:rPr>
+    </w:lvl>
+    <w:lvl w:ilvl="6" w:tentative="1">
+      <w:start w:val="1"/>
+      <w:numFmt w:val="bullet"/>
+      <w:lvlText w:val=""/>
+      <w:lvlJc w:val="left"/>
+      <w:pPr>
+        <w:tabs>
+          <w:tab w:val="num" w:pos="5040"/>
+        </w:tabs>
+        <w:ind w:left="5040" w:hanging="360"/>
+      </w:pPr>
+      <w:rPr>
+        <w:rFonts w:ascii="Wingdings" w:hAnsi="Wingdings" w:hint="default"/>
+        <w:sz w:val="20"/>
+      </w:rPr>
+    </w:lvl>
+    <w:lvl w:ilvl="7" w:tentative="1">
+      <w:start w:val="1"/>
+      <w:numFmt w:val="bullet"/>
+      <w:lvlText w:val=""/>
+      <w:lvlJc w:val="left"/>
+      <w:pPr>
+        <w:tabs>
+          <w:tab w:val="num" w:pos="5760"/>
+        </w:tabs>
+        <w:ind w:left="5760" w:hanging="360"/>
+      </w:pPr>
+      <w:rPr>
+        <w:rFonts w:ascii="Wingdings" w:hAnsi="Wingdings" w:hint="default"/>
+        <w:sz w:val="20"/>
+      </w:rPr>
+    </w:lvl>
+    <w:lvl w:ilvl="8" w:tentative="1">
+      <w:start w:val="1"/>
+      <w:numFmt w:val="bullet"/>
+      <w:lvlText w:val=""/>
+      <w:lvlJc w:val="left"/>
+      <w:pPr>
+        <w:tabs>
+          <w:tab w:val="num" w:pos="6480"/>
+        </w:tabs>
+        <w:ind w:left="6480" w:hanging="360"/>
+      </w:pPr>
+      <w:rPr>
+        <w:rFonts w:ascii="Wingdings" w:hAnsi="Wingdings" w:hint="default"/>
+        <w:sz w:val="20"/>
+      </w:rPr>
+    </w:lvl>
+  </w:abstractNum>
+  <w:abstractNum w:abstractNumId="1" w15:restartNumberingAfterBreak="0">
+    <w:nsid w:val="55446585"/>
+    <w:multiLevelType w:val="multilevel"/>
+    <w:tmpl w:val="C80646B6"/>
+    <w:lvl w:ilvl="0">
+      <w:start w:val="1"/>
+      <w:numFmt w:val="bullet"/>
+      <w:lvlText w:val=""/>
+      <w:lvlJc w:val="left"/>
+      <w:pPr>
+        <w:tabs>
+          <w:tab w:val="num" w:pos="720"/>
+        </w:tabs>
+        <w:ind w:left="720" w:hanging="360"/>
+      </w:pPr>
+      <w:rPr>
+        <w:rFonts w:ascii="Symbol" w:hAnsi="Symbol" w:hint="default"/>
+        <w:sz w:val="20"/>
+      </w:rPr>
+    </w:lvl>
+    <w:lvl w:ilvl="1" w:tentative="1">
+      <w:start w:val="1"/>
+      <w:numFmt w:val="bullet"/>
+      <w:lvlText w:val="o"/>
+      <w:lvlJc w:val="left"/>
+      <w:pPr>
+        <w:tabs>
+          <w:tab w:val="num" w:pos="1440"/>
+        </w:tabs>
+        <w:ind w:left="1440" w:hanging="360"/>
+      </w:pPr>
+      <w:rPr>
+        <w:rFonts w:ascii="Courier New" w:hAnsi="Courier New" w:hint="default"/>
+        <w:sz w:val="20"/>
+      </w:rPr>
+    </w:lvl>
+    <w:lvl w:ilvl="2" w:tentative="1">
+      <w:start w:val="1"/>
+      <w:numFmt w:val="bullet"/>
+      <w:lvlText w:val=""/>
+      <w:lvlJc w:val="left"/>
+      <w:pPr>
+        <w:tabs>
+          <w:tab w:val="num" w:pos="2160"/>
+        </w:tabs>
+        <w:ind w:left="2160" w:hanging="360"/>
+      </w:pPr>
+      <w:rPr>
+        <w:rFonts w:ascii="Wingdings" w:hAnsi="Wingdings" w:hint="default"/>
+        <w:sz w:val="20"/>
+      </w:rPr>
+    </w:lvl>
+    <w:lvl w:ilvl="3" w:tentative="1">
+      <w:start w:val="1"/>
+      <w:numFmt w:val="bullet"/>
+      <w:lvlText w:val=""/>
+      <w:lvlJc w:val="left"/>
+      <w:pPr>
+        <w:tabs>
+          <w:tab w:val="num" w:pos="2880"/>
+        </w:tabs>
+        <w:ind w:left="2880" w:hanging="360"/>
+      </w:pPr>
+      <w:rPr>
+        <w:rFonts w:ascii="Wingdings" w:hAnsi="Wingdings" w:hint="default"/>
+        <w:sz w:val="20"/>
+      </w:rPr>
+    </w:lvl>
+    <w:lvl w:ilvl="4" w:tentative="1">
+      <w:start w:val="1"/>
+      <w:numFmt w:val="bullet"/>
+      <w:lvlText w:val=""/>
+      <w:lvlJc w:val="left"/>
+      <w:pPr>
+        <w:tabs>
+          <w:tab w:val="num" w:pos="3600"/>
+        </w:tabs>
+        <w:ind w:left="3600" w:hanging="360"/>
+      </w:pPr>
+      <w:rPr>
+        <w:rFonts w:ascii="Wingdings" w:hAnsi="Wingdings" w:hint="default"/>
+        <w:sz w:val="20"/>
+      </w:rPr>
+    </w:lvl>
+    <w:lvl w:ilvl="5" w:tentative="1">
+      <w:start w:val="1"/>
+      <w:numFmt w:val="bullet"/>
+      <w:lvlText w:val=""/>
+      <w:lvlJc w:val="left"/>
+      <w:pPr>
+        <w:tabs>
+          <w:tab w:val="num" w:pos="4320"/>
+        </w:tabs>
+        <w:ind w:left="4320" w:hanging="360"/>
+      </w:pPr>
+      <w:rPr>
+        <w:rFonts w:ascii="Wingdings" w:hAnsi="Wingdings" w:hint="default"/>
+        <w:sz w:val="20"/>
+      </w:rPr>
+    </w:lvl>
+    <w:lvl w:ilvl="6" w:tentative="1">
+      <w:start w:val="1"/>
+      <w:numFmt w:val="bullet"/>
+      <w:lvlText w:val=""/>
+      <w:lvlJc w:val="left"/>
+      <w:pPr>
+        <w:tabs>
+          <w:tab w:val="num" w:pos="5040"/>
+        </w:tabs>
+        <w:ind w:left="5040" w:hanging="360"/>
+      </w:pPr>
+      <w:rPr>
+        <w:rFonts w:ascii="Wingdings" w:hAnsi="Wingdings" w:hint="default"/>
+        <w:sz w:val="20"/>
+      </w:rPr>
+    </w:lvl>
+    <w:lvl w:ilvl="7" w:tentative="1">
+      <w:start w:val="1"/>
+      <w:numFmt w:val="bullet"/>
+      <w:lvlText w:val=""/>
+      <w:lvlJc w:val="left"/>
+      <w:pPr>
+        <w:tabs>
+          <w:tab w:val="num" w:pos="5760"/>
+        </w:tabs>
+        <w:ind w:left="5760" w:hanging="360"/>
+      </w:pPr>
+      <w:rPr>
+        <w:rFonts w:ascii="Wingdings" w:hAnsi="Wingdings" w:hint="default"/>
+        <w:sz w:val="20"/>
+      </w:rPr>
+    </w:lvl>
+    <w:lvl w:ilvl="8" w:tentative="1">
+      <w:start w:val="1"/>
+      <w:numFmt w:val="bullet"/>
+      <w:lvlText w:val=""/>
+      <w:lvlJc w:val="left"/>
+      <w:pPr>
+        <w:tabs>
+          <w:tab w:val="num" w:pos="6480"/>
+        </w:tabs>
+        <w:ind w:left="6480" w:hanging="360"/>
+      </w:pPr>
+      <w:rPr>
+        <w:rFonts w:ascii="Wingdings" w:hAnsi="Wingdings" w:hint="default"/>
+        <w:sz w:val="20"/>
+      </w:rPr>
+    </w:lvl>
+  </w:abstractNum>
+  <w:abstractNum w:abstractNumId="2" w15:restartNumberingAfterBreak="0">
+    <w:nsid w:val="6F251F60"/>
+    <w:multiLevelType w:val="multilevel"/>
+    <w:tmpl w:val="97B46DBC"/>
+    <w:lvl w:ilvl="0">
+      <w:start w:val="1"/>
+      <w:numFmt w:val="bullet"/>
+      <w:lvlText w:val=""/>
+      <w:lvlJc w:val="left"/>
+      <w:pPr>
+        <w:tabs>
+          <w:tab w:val="num" w:pos="720"/>
+        </w:tabs>
+        <w:ind w:left="720" w:hanging="360"/>
+      </w:pPr>
+      <w:rPr>
+        <w:rFonts w:ascii="Symbol" w:hAnsi="Symbol" w:hint="default"/>
+        <w:sz w:val="20"/>
+      </w:rPr>
+    </w:lvl>
+    <w:lvl w:ilvl="1" w:tentative="1">
+      <w:start w:val="1"/>
+      <w:numFmt w:val="bullet"/>
+      <w:lvlText w:val="o"/>
+      <w:lvlJc w:val="left"/>
+      <w:pPr>
+        <w:tabs>
+          <w:tab w:val="num" w:pos="1440"/>
+        </w:tabs>
+        <w:ind w:left="1440" w:hanging="360"/>
+      </w:pPr>
+      <w:rPr>
+        <w:rFonts w:ascii="Courier New" w:hAnsi="Courier New" w:hint="default"/>
+        <w:sz w:val="20"/>
+      </w:rPr>
+    </w:lvl>
+    <w:lvl w:ilvl="2" w:tentative="1">
+      <w:start w:val="1"/>
+      <w:numFmt w:val="bullet"/>
+      <w:lvlText w:val=""/>
+      <w:lvlJc w:val="left"/>
+      <w:pPr>
+        <w:tabs>
+          <w:tab w:val="num" w:pos="2160"/>
+        </w:tabs>
+        <w:ind w:left="2160" w:hanging="360"/>
+      </w:pPr>
+      <w:rPr>
+        <w:rFonts w:ascii="Wingdings" w:hAnsi="Wingdings" w:hint="default"/>
+        <w:sz w:val="20"/>
+      </w:rPr>
+    </w:lvl>
+    <w:lvl w:ilvl="3" w:tentative="1">
+      <w:start w:val="1"/>
+      <w:numFmt w:val="bullet"/>
+      <w:lvlText w:val=""/>
+      <w:lvlJc w:val="left"/>
+      <w:pPr>
+        <w:tabs>
+          <w:tab w:val="num" w:pos="2880"/>
+        </w:tabs>
+        <w:ind w:left="2880" w:hanging="360"/>
+      </w:pPr>
+      <w:rPr>
+        <w:rFonts w:ascii="Wingdings" w:hAnsi="Wingdings" w:hint="default"/>
+        <w:sz w:val="20"/>
+      </w:rPr>
+    </w:lvl>
+    <w:lvl w:ilvl="4" w:tentative="1">
+      <w:start w:val="1"/>
+      <w:numFmt w:val="bullet"/>
+      <w:lvlText w:val=""/>
+      <w:lvlJc w:val="left"/>
+      <w:pPr>
+        <w:tabs>
+          <w:tab w:val="num" w:pos="3600"/>
+        </w:tabs>
+        <w:ind w:left="3600" w:hanging="360"/>
+      </w:pPr>
+      <w:rPr>
+        <w:rFonts w:ascii="Wingdings" w:hAnsi="Wingdings" w:hint="default"/>
+        <w:sz w:val="20"/>
+      </w:rPr>
+    </w:lvl>
+    <w:lvl w:ilvl="5" w:tentative="1">
+      <w:start w:val="1"/>
+      <w:numFmt w:val="bullet"/>
+      <w:lvlText w:val=""/>
+      <w:lvlJc w:val="left"/>
+      <w:pPr>
+        <w:tabs>
+          <w:tab w:val="num" w:pos="4320"/>
+        </w:tabs>
+        <w:ind w:left="4320" w:hanging="360"/>
+      </w:pPr>
+      <w:rPr>
+        <w:rFonts w:ascii="Wingdings" w:hAnsi="Wingdings" w:hint="default"/>
+        <w:sz w:val="20"/>
+      </w:rPr>
+    </w:lvl>
+    <w:lvl w:ilvl="6" w:tentative="1">
+      <w:start w:val="1"/>
+      <w:numFmt w:val="bullet"/>
+      <w:lvlText w:val=""/>
+      <w:lvlJc w:val="left"/>
+      <w:pPr>
+        <w:tabs>
+          <w:tab w:val="num" w:pos="5040"/>
+        </w:tabs>
+        <w:ind w:left="5040" w:hanging="360"/>
+      </w:pPr>
+      <w:rPr>
+        <w:rFonts w:ascii="Wingdings" w:hAnsi="Wingdings" w:hint="default"/>
+        <w:sz w:val="20"/>
+      </w:rPr>
+    </w:lvl>
+    <w:lvl w:ilvl="7" w:tentative="1">
+      <w:start w:val="1"/>
+      <w:numFmt w:val="bullet"/>
+      <w:lvlText w:val=""/>
+      <w:lvlJc w:val="left"/>
+      <w:pPr>
+        <w:tabs>
+          <w:tab w:val="num" w:pos="5760"/>
+        </w:tabs>
+        <w:ind w:left="5760" w:hanging="360"/>
+      </w:pPr>
+      <w:rPr>
+        <w:rFonts w:ascii="Wingdings" w:hAnsi="Wingdings" w:hint="default"/>
+        <w:sz w:val="20"/>
+      </w:rPr>
+    </w:lvl>
+    <w:lvl w:ilvl="8" w:tentative="1">
+      <w:start w:val="1"/>
+      <w:numFmt w:val="bullet"/>
+      <w:lvlText w:val=""/>
+      <w:lvlJc w:val="left"/>
+      <w:pPr>
+        <w:tabs>
+          <w:tab w:val="num" w:pos="6480"/>
+        </w:tabs>
+        <w:ind w:left="6480" w:hanging="360"/>
+      </w:pPr>
+      <w:rPr>
+        <w:rFonts w:ascii="Wingdings" w:hAnsi="Wingdings" w:hint="default"/>
+        <w:sz w:val="20"/>
+      </w:rPr>
+    </w:lvl>
+  </w:abstractNum>
+  <w:abstractNum w:abstractNumId="3" w15:restartNumberingAfterBreak="0">
     <w:nsid w:val="787F7FF4"/>
     <w:multiLevelType w:val="multilevel"/>
     <w:tmpl w:val="2A185F8C"/>
@@ -6194,7 +10589,16 @@
     </w:lvl>
   </w:abstractNum>
   <w:num w:numId="1" w16cid:durableId="1793086643">
+    <w:abstractNumId w:val="3"/>
+  </w:num>
+  <w:num w:numId="2" w16cid:durableId="2048871558">
     <w:abstractNumId w:val="0"/>
+  </w:num>
+  <w:num w:numId="3" w16cid:durableId="457840509">
+    <w:abstractNumId w:val="2"/>
+  </w:num>
+  <w:num w:numId="4" w16cid:durableId="520439925">
+    <w:abstractNumId w:val="1"/>
   </w:num>
 </w:numbering>
 </file>

</xml_diff>